<commit_message>
Second-round SEO/E-E-A-T remediation 2026-09-02: rebuild P0 (G01/G02/G04/V07) on primary sources, source-upgrade P1, strict confidence labels, evergreen URLs, 5-gate publish status, per-article R2 report
</commit_message>
<xml_diff>
--- a/deliveries/2026-09-02/01_Vehicle_Pages/VEH_20260902_01_BYD_Yuan_Plus_2024.docx
+++ b/deliveries/2026-09-02/01_Vehicle_Pages/VEH_20260902_01_BYD_Yuan_Plus_2024.docx
@@ -7,7 +7,7 @@
         <w:pStyle w:val="Title"/>
       </w:pPr>
       <w:r>
-        <w:t>BYD Yuan Plus 2024 (荣耀版) — Specifications, Variants &amp; Export Buyer Notes</w:t>
+        <w:t>BYD Yuan Plus (Atto 3) — Battery, Range Cycle, Charging and Export Buyer Notes</w:t>
       </w:r>
     </w:p>
     <w:p>
@@ -29,7 +29,7 @@
         <w:t>SEO Title</w:t>
       </w:r>
       <w:r>
-        <w:t>: BYD Yuan Plus 2024 Specifications, Variants &amp; Export Guide | AutoBridge</w:t>
+        <w:t>: BYD Yuan Plus / Atto 3: Battery, Range &amp; Export Buyer Guide</w:t>
       </w:r>
     </w:p>
     <w:p>
@@ -43,7 +43,7 @@
         <w:t>Meta Description</w:t>
       </w:r>
       <w:r>
-        <w:t>: Chinese-market reference specifications for the 2024 BYD Yuan Plus (荣耀版): 430/510 km CLTC variants, Blade Battery, motor, charging and what overseas buyers must verify before ordering.</w:t>
+        <w:t>: Chinese-market BYD Yuan Plus (Atto 3) explained for exporters — 49.92/60.48 kWh Blade Battery, CLTC vs WLTP range side by side, GB/T vs CCS charging, DiLink software limits and what to verify by VIN.</w:t>
       </w:r>
     </w:p>
     <w:p>
@@ -57,7 +57,7 @@
         <w:t>Suggested URL</w:t>
       </w:r>
       <w:r>
-        <w:t>: /vehicles/byd-yuan-plus-2024/</w:t>
+        <w:t>: /vehicles/byd-yuan-plus/</w:t>
       </w:r>
     </w:p>
     <w:p>
@@ -71,7 +71,7 @@
         <w:t>H1</w:t>
       </w:r>
       <w:r>
-        <w:t>: BYD Yuan Plus 2024 (荣耀版): Specifications, Variants and Export Buyer Notes</w:t>
+        <w:t>: BYD Yuan Plus (export name Atto 3): Battery, Range Cycle, Charging and Software for Importers</w:t>
       </w:r>
     </w:p>
     <w:p>
@@ -85,7 +85,7 @@
         <w:t>Primary Keyword</w:t>
       </w:r>
       <w:r>
-        <w:t>: BYD Yuan Plus 2024 specifications export</w:t>
+        <w:t>: BYD Yuan Plus Atto 3 specifications export</w:t>
       </w:r>
     </w:p>
     <w:p>
@@ -99,7 +99,7 @@
         <w:t>Secondary Search Terms</w:t>
       </w:r>
       <w:r>
-        <w:t>: BYD Atto 3 China specs, Yuan Plus 荣耀版 510km, BYD Blade Battery 60.48 kWh, Yuan Plus CLTC range, Chinese EV compact SUV export</w:t>
+        <w:t>: BYD Atto 3 battery 60.48 kWh, Yuan Plus CLTC vs WLTP range, BYD Blade Battery LFP, Atto 3 CCS2 charging, Yuan Plus DiLink overseas, Chinese EV compact SUV export</w:t>
       </w:r>
     </w:p>
     <w:p>
@@ -127,7 +127,7 @@
         <w:t>Image Suggestions</w:t>
       </w:r>
       <w:r>
-        <w:t>: front three-quarter studio view of 2024 Yuan Plus; 430 vs 510 variant comparison graphic; charging port close-up; rear seating and boot; DiLink rotating screen</w:t>
+        <w:t>: front three-quarter studio view; 430/510 vs WLTP variant comparison; charging port close-up; rear seating and boot; rotating DiLink screen</w:t>
       </w:r>
     </w:p>
     <w:p>
@@ -141,7 +141,7 @@
         <w:t>ALT Suggestions</w:t>
       </w:r>
       <w:r>
-        <w:t>: "2024 BYD Yuan Plus Glory Edition compact electric SUV, China reference specification"; "BYD Yuan Plus 430km vs 510km variant comparison"; "Yuan Plus Blade Battery charging port"</w:t>
+        <w:t>: "BYD Yuan Plus / Atto 3 compact electric SUV"; "Yuan Plus CLTC versus Atto 3 WLTP range comparison"; "Blade Battery charging port GB/T inlet"</w:t>
       </w:r>
     </w:p>
     <w:p>
@@ -149,21 +149,12 @@
         <w:pStyle w:val="Heading1"/>
       </w:pPr>
       <w:r>
-        <w:t>Buyer Context</w:t>
+        <w:t>Buyer Context: One Car, Two Specification Languages</w:t>
       </w:r>
     </w:p>
     <w:p>
       <w:r>
-        <w:t xml:space="preserve">The BYD Yuan Plus (元PLUS) is a compact all-electric SUV built on BYD's e-platform 3.0 and powered by the LFP Blade Battery. The line-up covered here is the </w:t>
-      </w:r>
-      <w:r>
-        <w:rPr>
-          <w:b/>
-        </w:rPr>
-        <w:t>2024 Glory Edition (荣耀版), launched in China in March 2024</w:t>
-      </w:r>
-      <w:r>
-        <w:t xml:space="preserve">. Outside China this model is marketed as the </w:t>
+        <w:t xml:space="preserve">The BYD Yuan Plus (元PLUS) is a compact all-electric SUV on BYD's e-platform 3.0 with an LFP Blade Battery; outside China it is sold as the </w:t>
       </w:r>
       <w:r>
         <w:rPr>
@@ -172,21 +163,25 @@
         <w:t>BYD Atto 3</w:t>
       </w:r>
       <w:r>
-        <w:t>, which is already sold across Europe, Southeast Asia, Latin America and Oceania, including right-hand-drive markets such as Thailand and Australia.</w:t>
-      </w:r>
-    </w:p>
-    <w:p>
-      <w:r>
-        <w:t xml:space="preserve">A sourcing distinction matters from the outset: the figures below are a </w:t>
+        <w:t xml:space="preserve"> across Europe, Southeast Asia, Latin America and Oceania, including RHD markets such as Thailand and Australia. The China line covered here is the </w:t>
       </w:r>
       <w:r>
         <w:rPr>
           <w:b/>
         </w:rPr>
-        <w:t>Chinese-market reference specification (REFERENCE MARKET: CHINA)</w:t>
+        <w:t>2024 Glory Edition (荣耀版)</w:t>
       </w:r>
       <w:r>
-        <w:t>. Export-market Atto 3 cars can differ in battery rating, charging connector, certified range (WLTP rather than CLTC), infotainment language and homologation. Treat this page as a way to understand the Chinese build and to ask precise questions — not as a single global specification sheet.</w:t>
+        <w:t xml:space="preserve">. The single most important sourcing habit is to keep two specification languages apart: </w:t>
+      </w:r>
+      <w:r>
+        <w:rPr>
+          <w:b/>
+        </w:rPr>
+        <w:t>Chinese-build data uses CLTC range and a GB/T charging inlet, while BYD's own export specification sheets use WLTP/NEDC range and regional connectors</w:t>
+      </w:r>
+      <w:r>
+        <w:t>. This is an evergreen model page (no year in the URL): the platform carries across model years, and the version-specific numbers below are labelled by market and cycle rather than presented as one "global spec".</w:t>
       </w:r>
     </w:p>
     <w:p>
@@ -194,12 +189,12 @@
         <w:pStyle w:val="Heading1"/>
       </w:pPr>
       <w:r>
-        <w:t>Variant Overview (China 2024 Glory Edition)</w:t>
+        <w:t>Battery and Variants (the EV decision starts here)</w:t>
       </w:r>
     </w:p>
     <w:p>
       <w:r>
-        <w:t>Chinese-market cars are split primarily by battery and CLTC range. A single front-mounted motor is used across the line.</w:t>
+        <w:t>Chinese cars are split by battery and CLTC range, with one front motor across the line.</w:t>
       </w:r>
     </w:p>
     <w:tbl>
@@ -253,7 +248,7 @@
                 <w:b/>
                 <w:sz w:val="20"/>
               </w:rPr>
-              <w:t>Battery</w:t>
+              <w:t>Blade Battery (LFP)</w:t>
             </w:r>
           </w:p>
         </w:tc>
@@ -274,7 +269,7 @@
                 <w:b/>
                 <w:sz w:val="20"/>
               </w:rPr>
-              <w:t>CLTC range</w:t>
+              <w:t>China CLTC range</w:t>
             </w:r>
           </w:p>
         </w:tc>
@@ -295,7 +290,7 @@
                 <w:b/>
                 <w:sz w:val="20"/>
               </w:rPr>
-              <w:t>DC fast-charge peak</w:t>
+              <w:t>Export Atto 3 equivalent (BYD-official)</w:t>
             </w:r>
           </w:p>
         </w:tc>
@@ -315,7 +310,7 @@
               <w:rPr>
                 <w:sz w:val="20"/>
               </w:rPr>
-              <w:t>430 km version</w:t>
+              <w:t>430 version</w:t>
             </w:r>
           </w:p>
         </w:tc>
@@ -333,7 +328,7 @@
               <w:rPr>
                 <w:sz w:val="20"/>
               </w:rPr>
-              <w:t>49.92 kWh LFP Blade Battery</w:t>
+              <w:t>49.92 kWh</w:t>
             </w:r>
           </w:p>
         </w:tc>
@@ -351,7 +346,7 @@
               <w:rPr>
                 <w:sz w:val="20"/>
               </w:rPr>
-              <w:t>430 km</w:t>
+              <w:t>430 km CLTC</w:t>
             </w:r>
           </w:p>
         </w:tc>
@@ -369,7 +364,7 @@
               <w:rPr>
                 <w:sz w:val="20"/>
               </w:rPr>
-              <w:t>70 kW</w:t>
+              <w:t>WLTP 345 km / NEDC 410 km</w:t>
             </w:r>
           </w:p>
         </w:tc>
@@ -389,7 +384,7 @@
               <w:rPr>
                 <w:sz w:val="20"/>
               </w:rPr>
-              <w:t>510 km version (representative: 510KM 领先型)</w:t>
+              <w:t>510 version (e.g., 510KM 领先型)</w:t>
             </w:r>
           </w:p>
         </w:tc>
@@ -407,7 +402,7 @@
               <w:rPr>
                 <w:sz w:val="20"/>
               </w:rPr>
-              <w:t>60.48 kWh LFP Blade Battery</w:t>
+              <w:t>60.48 kWh</w:t>
             </w:r>
           </w:p>
         </w:tc>
@@ -425,7 +420,7 @@
               <w:rPr>
                 <w:sz w:val="20"/>
               </w:rPr>
-              <w:t>510 km</w:t>
+              <w:t>510 km CLTC</w:t>
             </w:r>
           </w:p>
         </w:tc>
@@ -443,7 +438,7 @@
               <w:rPr>
                 <w:sz w:val="20"/>
               </w:rPr>
-              <w:t>80 kW</w:t>
+              <w:t>WLTP 420 km / NEDC 480 km</w:t>
             </w:r>
           </w:p>
         </w:tc>
@@ -451,7 +446,16 @@
     </w:tbl>
     <w:p>
       <w:r>
-        <w:t>Equipment grades step up through the range; higher trims (超越型 and above) add the DiPilot driver-assist package and larger rotating centre screen. Confirm the exact Chinese grade name on the proforma invoice, because the same "510" label can be attached to several trim levels with different equipment.</w:t>
+        <w:t xml:space="preserve">Battery capacities and the LFP Blade type are confirmed on </w:t>
+      </w:r>
+      <w:r>
+        <w:rPr>
+          <w:b/>
+        </w:rPr>
+        <w:t>BYD's own export specification sheets (VERIFIED)</w:t>
+      </w:r>
+      <w:r>
+        <w:t>; the China CLTC 430/510 labels are cross-checked across Chinese databases (CROSS_CHECKED). Higher grades add the DiPilot assist package and the larger rotating screen — record the exact Chinese grade name, because a "510" label can attach to several equipment levels.</w:t>
       </w:r>
     </w:p>
     <w:p>
@@ -459,476 +463,21 @@
         <w:pStyle w:val="Heading1"/>
       </w:pPr>
       <w:r>
-        <w:t>Verified Specifications — Chinese-Market Reference</w:t>
+        <w:t>Powertrain</w:t>
       </w:r>
     </w:p>
     <w:p>
       <w:r>
-        <w:t xml:space="preserve">These values were cross-checked across three independent Chinese vehicle databases (ZOL, Dongchedi, Autohome) on 2026-09-02; they are </w:t>
+        <w:t xml:space="preserve">Every China Glory Edition Yuan Plus uses one front permanent-magnet synchronous motor: </w:t>
       </w:r>
       <w:r>
         <w:rPr>
           <w:b/>
         </w:rPr>
-        <w:t>CROSS_CHECKED</w:t>
+        <w:t>150 kW (204 PS) / 310 N·m</w:t>
       </w:r>
       <w:r>
-        <w:t>, not taken from a single captured BYD OEM sheet.</w:t>
-      </w:r>
-    </w:p>
-    <w:tbl>
-      <w:tblPr>
-        <w:tblStyle w:val="TableGrid"/>
-        <w:tblW w:type="auto" w:w="0"/>
-        <w:tblLook w:firstColumn="1" w:firstRow="1" w:lastColumn="0" w:lastRow="0" w:noHBand="0" w:noVBand="1" w:val="04A0"/>
-      </w:tblPr>
-      <w:tblGrid>
-        <w:gridCol w:w="4320"/>
-        <w:gridCol w:w="4320"/>
-      </w:tblGrid>
-      <w:tr>
-        <w:tc>
-          <w:tcPr>
-            <w:tcW w:type="dxa" w:w="4320"/>
-            <w:shd w:val="clear" w:fill="EAF0F6"/>
-          </w:tcPr>
-          <w:p>
-            <w:r>
-              <w:rPr>
-                <w:b/>
-                <w:sz w:val="20"/>
-              </w:rPr>
-            </w:r>
-            <w:r>
-              <w:rPr>
-                <w:b/>
-                <w:sz w:val="20"/>
-              </w:rPr>
-              <w:t>Item</w:t>
-            </w:r>
-          </w:p>
-        </w:tc>
-        <w:tc>
-          <w:tcPr>
-            <w:tcW w:type="dxa" w:w="4320"/>
-            <w:shd w:val="clear" w:fill="EAF0F6"/>
-          </w:tcPr>
-          <w:p>
-            <w:r>
-              <w:rPr>
-                <w:b/>
-                <w:sz w:val="20"/>
-              </w:rPr>
-            </w:r>
-            <w:r>
-              <w:rPr>
-                <w:b/>
-                <w:sz w:val="20"/>
-              </w:rPr>
-              <w:t>Chinese-market reference value</w:t>
-            </w:r>
-          </w:p>
-        </w:tc>
-      </w:tr>
-      <w:tr>
-        <w:tc>
-          <w:tcPr>
-            <w:tcW w:type="dxa" w:w="4320"/>
-          </w:tcPr>
-          <w:p>
-            <w:r>
-              <w:rPr>
-                <w:sz w:val="20"/>
-              </w:rPr>
-            </w:r>
-            <w:r>
-              <w:rPr>
-                <w:sz w:val="20"/>
-              </w:rPr>
-              <w:t>Body / seats</w:t>
-            </w:r>
-          </w:p>
-        </w:tc>
-        <w:tc>
-          <w:tcPr>
-            <w:tcW w:type="dxa" w:w="4320"/>
-          </w:tcPr>
-          <w:p>
-            <w:r>
-              <w:rPr>
-                <w:sz w:val="20"/>
-              </w:rPr>
-            </w:r>
-            <w:r>
-              <w:rPr>
-                <w:sz w:val="20"/>
-              </w:rPr>
-              <w:t>5-door, 5-seat compact SUV, monocoque (承载式)</w:t>
-            </w:r>
-          </w:p>
-        </w:tc>
-      </w:tr>
-      <w:tr>
-        <w:tc>
-          <w:tcPr>
-            <w:tcW w:type="dxa" w:w="4320"/>
-          </w:tcPr>
-          <w:p>
-            <w:r>
-              <w:rPr>
-                <w:sz w:val="20"/>
-              </w:rPr>
-            </w:r>
-            <w:r>
-              <w:rPr>
-                <w:sz w:val="20"/>
-              </w:rPr>
-              <w:t>Length × Width × Height</w:t>
-            </w:r>
-          </w:p>
-        </w:tc>
-        <w:tc>
-          <w:tcPr>
-            <w:tcW w:type="dxa" w:w="4320"/>
-          </w:tcPr>
-          <w:p>
-            <w:r>
-              <w:rPr>
-                <w:sz w:val="20"/>
-              </w:rPr>
-            </w:r>
-            <w:r>
-              <w:rPr>
-                <w:sz w:val="20"/>
-              </w:rPr>
-              <w:t>4455 × 1875 × 1615 mm</w:t>
-            </w:r>
-          </w:p>
-        </w:tc>
-      </w:tr>
-      <w:tr>
-        <w:tc>
-          <w:tcPr>
-            <w:tcW w:type="dxa" w:w="4320"/>
-          </w:tcPr>
-          <w:p>
-            <w:r>
-              <w:rPr>
-                <w:sz w:val="20"/>
-              </w:rPr>
-            </w:r>
-            <w:r>
-              <w:rPr>
-                <w:sz w:val="20"/>
-              </w:rPr>
-              <w:t>Wheelbase</w:t>
-            </w:r>
-          </w:p>
-        </w:tc>
-        <w:tc>
-          <w:tcPr>
-            <w:tcW w:type="dxa" w:w="4320"/>
-          </w:tcPr>
-          <w:p>
-            <w:r>
-              <w:rPr>
-                <w:sz w:val="20"/>
-              </w:rPr>
-            </w:r>
-            <w:r>
-              <w:rPr>
-                <w:sz w:val="20"/>
-              </w:rPr>
-              <w:t>2720 mm</w:t>
-            </w:r>
-          </w:p>
-        </w:tc>
-      </w:tr>
-      <w:tr>
-        <w:tc>
-          <w:tcPr>
-            <w:tcW w:type="dxa" w:w="4320"/>
-          </w:tcPr>
-          <w:p>
-            <w:r>
-              <w:rPr>
-                <w:sz w:val="20"/>
-              </w:rPr>
-            </w:r>
-            <w:r>
-              <w:rPr>
-                <w:sz w:val="20"/>
-              </w:rPr>
-              <w:t>Motor</w:t>
-            </w:r>
-          </w:p>
-        </w:tc>
-        <w:tc>
-          <w:tcPr>
-            <w:tcW w:type="dxa" w:w="4320"/>
-          </w:tcPr>
-          <w:p>
-            <w:r>
-              <w:rPr>
-                <w:sz w:val="20"/>
-              </w:rPr>
-            </w:r>
-            <w:r>
-              <w:rPr>
-                <w:sz w:val="20"/>
-              </w:rPr>
-              <w:t>Front permanent-magnet synchronous, single motor</w:t>
-            </w:r>
-          </w:p>
-        </w:tc>
-      </w:tr>
-      <w:tr>
-        <w:tc>
-          <w:tcPr>
-            <w:tcW w:type="dxa" w:w="4320"/>
-          </w:tcPr>
-          <w:p>
-            <w:r>
-              <w:rPr>
-                <w:sz w:val="20"/>
-              </w:rPr>
-            </w:r>
-            <w:r>
-              <w:rPr>
-                <w:sz w:val="20"/>
-              </w:rPr>
-              <w:t>Peak power / torque</w:t>
-            </w:r>
-          </w:p>
-        </w:tc>
-        <w:tc>
-          <w:tcPr>
-            <w:tcW w:type="dxa" w:w="4320"/>
-          </w:tcPr>
-          <w:p>
-            <w:r>
-              <w:rPr>
-                <w:sz w:val="20"/>
-              </w:rPr>
-            </w:r>
-            <w:r>
-              <w:rPr>
-                <w:sz w:val="20"/>
-              </w:rPr>
-              <w:t>150 kW (204 PS) / 310 N·m</w:t>
-            </w:r>
-          </w:p>
-        </w:tc>
-      </w:tr>
-      <w:tr>
-        <w:tc>
-          <w:tcPr>
-            <w:tcW w:type="dxa" w:w="4320"/>
-          </w:tcPr>
-          <w:p>
-            <w:r>
-              <w:rPr>
-                <w:sz w:val="20"/>
-              </w:rPr>
-            </w:r>
-            <w:r>
-              <w:rPr>
-                <w:sz w:val="20"/>
-              </w:rPr>
-              <w:t>0–100 km/h</w:t>
-            </w:r>
-          </w:p>
-        </w:tc>
-        <w:tc>
-          <w:tcPr>
-            <w:tcW w:type="dxa" w:w="4320"/>
-          </w:tcPr>
-          <w:p>
-            <w:r>
-              <w:rPr>
-                <w:sz w:val="20"/>
-              </w:rPr>
-            </w:r>
-            <w:r>
-              <w:rPr>
-                <w:sz w:val="20"/>
-              </w:rPr>
-              <w:t>7.3 s</w:t>
-            </w:r>
-          </w:p>
-        </w:tc>
-      </w:tr>
-      <w:tr>
-        <w:tc>
-          <w:tcPr>
-            <w:tcW w:type="dxa" w:w="4320"/>
-          </w:tcPr>
-          <w:p>
-            <w:r>
-              <w:rPr>
-                <w:sz w:val="20"/>
-              </w:rPr>
-            </w:r>
-            <w:r>
-              <w:rPr>
-                <w:sz w:val="20"/>
-              </w:rPr>
-              <w:t>Top speed</w:t>
-            </w:r>
-          </w:p>
-        </w:tc>
-        <w:tc>
-          <w:tcPr>
-            <w:tcW w:type="dxa" w:w="4320"/>
-          </w:tcPr>
-          <w:p>
-            <w:r>
-              <w:rPr>
-                <w:sz w:val="20"/>
-              </w:rPr>
-            </w:r>
-            <w:r>
-              <w:rPr>
-                <w:sz w:val="20"/>
-              </w:rPr>
-              <w:t>160 km/h</w:t>
-            </w:r>
-          </w:p>
-        </w:tc>
-      </w:tr>
-      <w:tr>
-        <w:tc>
-          <w:tcPr>
-            <w:tcW w:type="dxa" w:w="4320"/>
-          </w:tcPr>
-          <w:p>
-            <w:r>
-              <w:rPr>
-                <w:sz w:val="20"/>
-              </w:rPr>
-            </w:r>
-            <w:r>
-              <w:rPr>
-                <w:sz w:val="20"/>
-              </w:rPr>
-              <w:t>Battery</w:t>
-            </w:r>
-          </w:p>
-        </w:tc>
-        <w:tc>
-          <w:tcPr>
-            <w:tcW w:type="dxa" w:w="4320"/>
-          </w:tcPr>
-          <w:p>
-            <w:r>
-              <w:rPr>
-                <w:sz w:val="20"/>
-              </w:rPr>
-            </w:r>
-            <w:r>
-              <w:rPr>
-                <w:sz w:val="20"/>
-              </w:rPr>
-              <w:t>LFP Blade Battery, 49.92 kWh (430) / 60.48 kWh (510)</w:t>
-            </w:r>
-          </w:p>
-        </w:tc>
-      </w:tr>
-      <w:tr>
-        <w:tc>
-          <w:tcPr>
-            <w:tcW w:type="dxa" w:w="4320"/>
-          </w:tcPr>
-          <w:p>
-            <w:r>
-              <w:rPr>
-                <w:sz w:val="20"/>
-              </w:rPr>
-            </w:r>
-            <w:r>
-              <w:rPr>
-                <w:sz w:val="20"/>
-              </w:rPr>
-              <w:t>Range standard</w:t>
-            </w:r>
-          </w:p>
-        </w:tc>
-        <w:tc>
-          <w:tcPr>
-            <w:tcW w:type="dxa" w:w="4320"/>
-          </w:tcPr>
-          <w:p>
-            <w:r>
-              <w:rPr>
-                <w:sz w:val="20"/>
-              </w:rPr>
-            </w:r>
-            <w:r>
-              <w:rPr>
-                <w:b/>
-                <w:sz w:val="20"/>
-              </w:rPr>
-              <w:t>CLTC</w:t>
-            </w:r>
-            <w:r>
-              <w:rPr>
-                <w:sz w:val="20"/>
-              </w:rPr>
-              <w:t xml:space="preserve"> 430 / 510 km (China cycle)</w:t>
-            </w:r>
-          </w:p>
-        </w:tc>
-      </w:tr>
-      <w:tr>
-        <w:tc>
-          <w:tcPr>
-            <w:tcW w:type="dxa" w:w="4320"/>
-          </w:tcPr>
-          <w:p>
-            <w:r>
-              <w:rPr>
-                <w:sz w:val="20"/>
-              </w:rPr>
-            </w:r>
-            <w:r>
-              <w:rPr>
-                <w:sz w:val="20"/>
-              </w:rPr>
-              <w:t>DC fast charge</w:t>
-            </w:r>
-          </w:p>
-        </w:tc>
-        <w:tc>
-          <w:tcPr>
-            <w:tcW w:type="dxa" w:w="4320"/>
-          </w:tcPr>
-          <w:p>
-            <w:r>
-              <w:rPr>
-                <w:sz w:val="20"/>
-              </w:rPr>
-            </w:r>
-            <w:r>
-              <w:rPr>
-                <w:sz w:val="20"/>
-              </w:rPr>
-              <w:t>70 kW (430) / 80 kW (510)</w:t>
-            </w:r>
-          </w:p>
-        </w:tc>
-      </w:tr>
-    </w:tbl>
-    <w:p>
-      <w:pPr>
-        <w:pStyle w:val="Heading1"/>
-      </w:pPr>
-      <w:r>
-        <w:t>Powertrain and Driving Character</w:t>
-      </w:r>
-    </w:p>
-    <w:p>
-      <w:r>
-        <w:t>Every 2024 Glory Edition Yuan Plus uses one front-mounted 150 kW permanent-magnet motor with 310 N·m, so variant choice is about battery and equipment rather than a second performance tier. The 7.3-second 0–100 km/h figure and 160 km/h top speed are consistent across the range. For an importer this simplifies the drivetrain question — there is no AWD or dual-motor version in this China line — but it also means any quoted "performance" or "dual-motor" Yuan Plus should be treated as a different model-year or market build and re-documented.</w:t>
+        <w:t>, 0–100 km/h 7.3 s, top speed 160 km/h, front-wheel drive only (no AWD/dual-motor in this line). BYD's export sheets confirm the PMSM layout and the 49.92/60.48 kWh battery pair; if a quoted car claims AWD, dual motors or a different output, it is another model-year or market build and must be re-documented rather than assumed.</w:t>
       </w:r>
     </w:p>
     <w:p>
@@ -936,26 +485,21 @@
         <w:pStyle w:val="Heading1"/>
       </w:pPr>
       <w:r>
-        <w:t>Battery, Range and Charging</w:t>
+        <w:t>Range Cycle: Never Present CLTC as WLTP</w:t>
       </w:r>
     </w:p>
     <w:p>
       <w:r>
-        <w:t>The LFP Blade Battery is the core technical selling point, at 49.92 kWh for the 430 km car and 60.48 kWh for the 510 km car. Two procurement-sensitive details follow:</w:t>
+        <w:t xml:space="preserve">This is where importers most often mis-spec a car. The </w:t>
       </w:r>
-    </w:p>
-    <w:p>
-      <w:pPr>
-        <w:pStyle w:val="ListBullet"/>
-      </w:pPr>
       <w:r>
         <w:rPr>
           <w:b/>
         </w:rPr>
-        <w:t>Range cycle</w:t>
+        <w:t>same 60.48 kWh pack</w:t>
       </w:r>
       <w:r>
-        <w:t xml:space="preserve">: Chinese figures use </w:t>
+        <w:t xml:space="preserve"> is labelled 510 km under China </w:t>
       </w:r>
       <w:r>
         <w:rPr>
@@ -964,7 +508,33 @@
         <w:t>CLTC</w:t>
       </w:r>
       <w:r>
-        <w:t>, which returns higher numbers than the WLTP cycle used in Europe, Australia and many export markets. Never present the 430/510 km CLTC values as WLTP-equivalent; ask for the destination-market certified figure.</w:t>
+        <w:t xml:space="preserve">, 480 km under </w:t>
+      </w:r>
+      <w:r>
+        <w:rPr>
+          <w:b/>
+        </w:rPr>
+        <w:t>NEDC</w:t>
+      </w:r>
+      <w:r>
+        <w:t xml:space="preserve"> and 420 km under the more conservative </w:t>
+      </w:r>
+      <w:r>
+        <w:rPr>
+          <w:b/>
+        </w:rPr>
+        <w:t>WLTP</w:t>
+      </w:r>
+      <w:r>
+        <w:t xml:space="preserve"> used in Europe/Australia. Always quote the cycle next to the number, request the destination-certified figure, and do not market a CLTC number to a WLTP market. BYD's regional spec sheets (e.g., its South Africa and Hong Kong PDFs) publish the WLTP/NEDC values directly — use those for an export customer and the Chinese figures only to identify the China build.</w:t>
+      </w:r>
+    </w:p>
+    <w:p>
+      <w:pPr>
+        <w:pStyle w:val="Heading1"/>
+      </w:pPr>
+      <w:r>
+        <w:t>Charging: Physical Inlet + Protocol</w:t>
       </w:r>
     </w:p>
     <w:p>
@@ -972,13 +542,41 @@
         <w:pStyle w:val="ListBullet"/>
       </w:pPr>
       <w:r>
+        <w:t xml:space="preserve">Chinese cars use the </w:t>
+      </w:r>
+      <w:r>
         <w:rPr>
           <w:b/>
         </w:rPr>
-        <w:t>Charging interface</w:t>
+        <w:t>GB/T</w:t>
       </w:r>
       <w:r>
-        <w:t>: Chinese cars use the GB/T DC and AC interface standard. Export Atto 3 vehicles commonly use CCS2 (and the connector mix changes by destination). Confirm the physical socket and AC/DC charging protocol on the VIN-specific car rather than assuming the Chinese GB/T configuration will work at destination chargers. Our compatibility guide details GB/T versus CCS2/CHAdeMO and adapter limits.</w:t>
+        <w:t xml:space="preserve"> DC/AC inlet and GB/T 27930 handshake; export Atto 3 builds commonly use </w:t>
+      </w:r>
+      <w:r>
+        <w:rPr>
+          <w:b/>
+        </w:rPr>
+        <w:t>CCS2</w:t>
+      </w:r>
+      <w:r>
+        <w:t xml:space="preserve"> (regional variation exists). The socket is a VIN-level fact — confirm it on the actual car.</w:t>
+      </w:r>
+    </w:p>
+    <w:p>
+      <w:pPr>
+        <w:pStyle w:val="ListBullet"/>
+      </w:pPr>
+      <w:r>
+        <w:t>Recorded China DC fast-charge peaks are 70 kW (49.92) / 80 kW (60.48); BYD export material lists an 110 kW DC figure for certain market builds. Treat charge power as market/version-specific and confirm from the destination sheet, not from a single database.</w:t>
+      </w:r>
+    </w:p>
+    <w:p>
+      <w:pPr>
+        <w:pStyle w:val="ListBullet"/>
+      </w:pPr>
+      <w:r>
+        <w:t>AC onboard-charger rating and any adapter limits must be specified at order; see the GB/T vs CCS2/CHAdeMO compatibility guide.</w:t>
       </w:r>
     </w:p>
     <w:p>
@@ -986,12 +584,21 @@
         <w:pStyle w:val="Heading1"/>
       </w:pPr>
       <w:r>
-        <w:t>Cabin, Seating and Connected Equipment</w:t>
+        <w:t>Software and OTA (the part homologation does not fix)</w:t>
       </w:r>
     </w:p>
     <w:p>
       <w:r>
-        <w:t xml:space="preserve">The Yuan Plus is a five-seat monocoque SUV with a 2720 mm wheelbase. Higher Chinese grades carry BYD's DiLink cockpit with a rotating 12.8-inch (or 15.6-inch on upper trims) centre display, OTA updates and 4G connectivity. Upper trims also add </w:t>
+        <w:t xml:space="preserve">Upper grades carry BYD </w:t>
+      </w:r>
+      <w:r>
+        <w:rPr>
+          <w:b/>
+        </w:rPr>
+        <w:t>DiLink</w:t>
+      </w:r>
+      <w:r>
+        <w:t xml:space="preserve"> with a rotating 12.8/15.6-inch display, OTA and 4G, plus </w:t>
       </w:r>
       <w:r>
         <w:rPr>
@@ -1000,7 +607,7 @@
         <w:t>DiPilot</w:t>
       </w:r>
       <w:r>
-        <w:t xml:space="preserve"> L2-class assistance (adaptive cruise, lane keeping, autonomous emergency braking). Two export cautions: Chinese-market DiLink software, app ecosystem and voice assistant are built for mainland China, and OTA behaviour outside China is not guaranteed — verify English/local-language HMI, app availability and which connected functions remain live in the destination country before committing to a volume order.</w:t>
+        <w:t xml:space="preserve"> L2-class assistance (ACC, lane keeping, AEB). Chinese-market DiLink — app ecosystem, voice assistant, account server and navigation — is built for mainland China, and OTA delivery outside China is not guaranteed for a parallel-imported China unit. Verify English/local HMI, local maps, app availability and which connected functions stay live in the destination country before a volume order; the infotainment/OTA localization guide gives a per-VIN acceptance test.</w:t>
       </w:r>
     </w:p>
     <w:p>
@@ -1008,12 +615,42 @@
         <w:pStyle w:val="Heading1"/>
       </w:pPr>
       <w:r>
-        <w:t>Overseas Buyer Verification Checklist</w:t>
+        <w:t>Dimensions and Cabin</w:t>
       </w:r>
     </w:p>
     <w:p>
       <w:r>
-        <w:t>Before paying a deposit on a China-sourced Yuan Plus:</w:t>
+        <w:t>4455 × 1875 × 1615 mm, wheelbase 2720 mm, five-door five-seat monocoque compact SUV (dimensions confirmed on BYD's export sheet). Confirm curb weight by battery/trim on the compliance plate rather than a generic figure.</w:t>
+      </w:r>
+    </w:p>
+    <w:p>
+      <w:pPr>
+        <w:pStyle w:val="Heading1"/>
+      </w:pPr>
+      <w:r>
+        <w:t>What AutoBridge Adds Beyond the Parameter Sites</w:t>
+      </w:r>
+    </w:p>
+    <w:p>
+      <w:r>
+        <w:t xml:space="preserve">Spec sites list Chinese numbers in isolation and leave the buyer to reconcile them with export reality. AutoBridge supplies a </w:t>
+      </w:r>
+      <w:r>
+        <w:rPr>
+          <w:b/>
+        </w:rPr>
+        <w:t>single build sheet that pairs each VIN's battery size with BOTH its CLTC label and the destination-market WLTP/NEDC figure</w:t>
+      </w:r>
+      <w:r>
+        <w:t>, flags GB/T-vs-CCS inlet before deposit, and records the exact Chinese grade so a "510" cannot be substituted by a lower-equipped car. That version-and-cycle reconciliation is the value a raw spec table does not provide.</w:t>
+      </w:r>
+    </w:p>
+    <w:p>
+      <w:pPr>
+        <w:pStyle w:val="Heading1"/>
+      </w:pPr>
+      <w:r>
+        <w:t>Overseas Buyer Verification Before Payment</w:t>
       </w:r>
     </w:p>
     <w:p>
@@ -1021,25 +658,16 @@
         <w:pStyle w:val="ListBullet"/>
       </w:pPr>
       <w:r>
-        <w:t xml:space="preserve">Confirm whether you are buying the </w:t>
+        <w:t xml:space="preserve">Identify </w:t>
       </w:r>
       <w:r>
         <w:rPr>
           <w:b/>
         </w:rPr>
-        <w:t>China Yuan Plus</w:t>
+        <w:t>China Yuan Plus vs destination Atto 3</w:t>
       </w:r>
       <w:r>
-        <w:t xml:space="preserve"> or a destination-built/market </w:t>
-      </w:r>
-      <w:r>
-        <w:rPr>
-          <w:b/>
-        </w:rPr>
-        <w:t>Atto 3</w:t>
-      </w:r>
-      <w:r>
-        <w:t>, and record the exact model year and Chinese grade.</w:t>
+        <w:t>; record model year and exact Chinese grade.</w:t>
       </w:r>
     </w:p>
     <w:p>
@@ -1047,7 +675,16 @@
         <w:pStyle w:val="ListBullet"/>
       </w:pPr>
       <w:r>
-        <w:t>Match the VIN to battery size (49.92 vs 60.48 kWh), CLTC range and fast-charge power — do not rely on a sales label alone.</w:t>
+        <w:t xml:space="preserve">Match VIN to battery (49.92/60.48), the correct range </w:t>
+      </w:r>
+      <w:r>
+        <w:rPr>
+          <w:b/>
+        </w:rPr>
+        <w:t>cycle</w:t>
+      </w:r>
+      <w:r>
+        <w:t>, and charge power — never a sales label alone.</w:t>
       </w:r>
     </w:p>
     <w:p>
@@ -1055,16 +692,16 @@
         <w:pStyle w:val="ListBullet"/>
       </w:pPr>
       <w:r>
-        <w:t xml:space="preserve">Verify </w:t>
+        <w:t xml:space="preserve">Confirm </w:t>
       </w:r>
       <w:r>
         <w:rPr>
           <w:b/>
         </w:rPr>
-        <w:t>steering side (LHD/RHD)</w:t>
+        <w:t>LHD/RHD</w:t>
       </w:r>
       <w:r>
-        <w:t xml:space="preserve"> availability for your market and whether the specific unit is factory RHD or a China LHD car.</w:t>
+        <w:t xml:space="preserve"> and whether the unit is factory RHD or a China LHD car.</w:t>
       </w:r>
     </w:p>
     <w:p>
@@ -1072,7 +709,7 @@
         <w:pStyle w:val="ListBullet"/>
       </w:pPr>
       <w:r>
-        <w:t>Verify charging connector (GB/T vs CCS2/other), onboard charger and any adapter limitations.</w:t>
+        <w:t>Confirm charging inlet (GB/T vs CCS2/other), onboard charger and adapter limits.</w:t>
       </w:r>
     </w:p>
     <w:p>
@@ -1080,7 +717,7 @@
         <w:pStyle w:val="ListBullet"/>
       </w:pPr>
       <w:r>
-        <w:t>Obtain the destination-market homologation/certification route; Chinese-spec sheets do not prove type approval in your country.</w:t>
+        <w:t>Confirm infotainment language, maps, app store and OTA support outside mainland China.</w:t>
       </w:r>
     </w:p>
     <w:p>
@@ -1088,7 +725,7 @@
         <w:pStyle w:val="ListBullet"/>
       </w:pPr>
       <w:r>
-        <w:t>Confirm infotainment language, navigation maps, app store and OTA support outside mainland China.</w:t>
+        <w:t>Obtain the destination homologation route; a Chinese spec sheet is not type approval.</w:t>
       </w:r>
     </w:p>
     <w:p>
@@ -1096,7 +733,7 @@
         <w:pStyle w:val="ListBullet"/>
       </w:pPr>
       <w:r>
-        <w:t>Check warranty validity and after-sales coverage for a parallel-imported China unit versus an official Atto 3.</w:t>
+        <w:t>Compare warranty for a parallel China unit vs an official Atto 3.</w:t>
       </w:r>
     </w:p>
     <w:p>
@@ -1109,22 +746,22 @@
     </w:p>
     <w:p>
       <w:r>
-        <w:t xml:space="preserve">AutoBridge does not publish a fixed export price list, and the Chinese domestic guide price (RMB 119,800–147,800 for the 2024 Glory Edition, a </w:t>
+        <w:t xml:space="preserve">No fixed export price is published. The China domestic guide price for the 2024 Glory Edition is a </w:t>
       </w:r>
       <w:r>
         <w:rPr>
           <w:b/>
         </w:rPr>
-        <w:t>China domestic reference only, time-sensitive, not an export quote and not convertible to an FOB/CIF price</w:t>
+        <w:t>domestic, time-sensitive reference only — not an FOB/CIF figure</w:t>
       </w:r>
       <w:r>
-        <w:t xml:space="preserve">) should never be treated as a landed cost. For a current quotation, send an enquiry with: </w:t>
+        <w:t xml:space="preserve">. Enquire with </w:t>
       </w:r>
       <w:r>
         <w:rPr>
           <w:b/>
         </w:rPr>
-        <w:t>Destination Country · Quantity · Preferred Trim (430/510 and grade) · LHD/RHD · Destination Port · Incoterm</w:t>
+        <w:t>Destination Country · Quantity · Battery/Grade · LHD/RHD · Destination Port · Incoterm</w:t>
       </w:r>
       <w:r>
         <w:t>.</w:t>
@@ -1143,24 +780,20 @@
         <w:rPr>
           <w:b/>
         </w:rPr>
-        <w:t>Is the BYD Yuan Plus the same car as the Atto 3?</w:t>
+        <w:t>Is Yuan Plus the same car as Atto 3?</w:t>
       </w:r>
       <w:r>
-        <w:t xml:space="preserve"> It is the China-market counterpart of the export Atto 3, but specifications, charging connector, range cycle and software differ by market. Confirm the exact build rather than assuming identical specs.</w:t>
+        <w:t xml:space="preserve"> It is the China counterpart of the export Atto 3, but connector, certified range cycle and software differ by market — confirm the exact build. </w:t>
       </w:r>
-    </w:p>
-    <w:p>
       <w:r>
         <w:rPr>
           <w:b/>
         </w:rPr>
-        <w:t>Why is the range 510 km in China but lower in Europe?</w:t>
+        <w:t>Why is range 510 km in China and 420 km in Europe for the same 60.48 kWh battery?</w:t>
       </w:r>
       <w:r>
-        <w:t xml:space="preserve"> China certifies on CLTC; export markets such as Europe and Australia use WLTP, which is more conservative. The same 60.48 kWh battery therefore carries different official range labels.</w:t>
+        <w:t xml:space="preserve"> Because China uses CLTC and export markets use WLTP/NEDC; always state the cycle. </w:t>
       </w:r>
-    </w:p>
-    <w:p>
       <w:r>
         <w:rPr>
           <w:b/>
@@ -1168,40 +801,25 @@
         <w:t>Does every Yuan Plus have the same motor?</w:t>
       </w:r>
       <w:r>
-        <w:t xml:space="preserve"> In the 2024 China Glory Edition line, yes: a single 150 kW/310 N·m front motor across 430 and 510 versions; variants differ mainly in battery and trim.</w:t>
+        <w:t xml:space="preserve"> In this China line, one 150 kW/310 N·m front motor; variants differ in battery and equipment. </w:t>
       </w:r>
-    </w:p>
-    <w:p>
       <w:r>
         <w:rPr>
           <w:b/>
         </w:rPr>
-        <w:t>Can a China GB/T charging car be used in a CCS2 market?</w:t>
+        <w:t>Can a GB/T car charge on CCS2?</w:t>
       </w:r>
       <w:r>
-        <w:t xml:space="preserve"> Not without confirming the connector and any adapter constraints; destination-market Atto 3 units are typically built to the local standard, so specify charging at order stage.</w:t>
+        <w:t xml:space="preserve"> Only with the correct inlet/adapter confirmed for legality and handshake; destination Atto 3 units are usually built to the local standard — specify at order. </w:t>
       </w:r>
-    </w:p>
-    <w:p>
       <w:r>
         <w:rPr>
           <w:b/>
         </w:rPr>
-        <w:t>Is the China domestic price the export FOB price?</w:t>
+        <w:t>Is the China price an FOB quote?</w:t>
       </w:r>
       <w:r>
-        <w:t xml:space="preserve"> No. The RMB guide price is a domestic reference only; request an itemised export quotation for your port and Incoterm.</w:t>
-      </w:r>
-    </w:p>
-    <w:p>
-      <w:r>
-        <w:rPr>
-          <w:b/>
-        </w:rPr>
-        <w:t>Which trim carries DiPilot and the larger screen?</w:t>
-      </w:r>
-      <w:r>
-        <w:t xml:space="preserve"> On the Chinese line, higher grades (超越型 and above) add L2 DiPilot and the 15.6-inch rotating screen; verify equipment by exact grade name.</w:t>
+        <w:t xml:space="preserve"> No; it is a domestic reference. Request an itemised export quotation.</w:t>
       </w:r>
     </w:p>
     <w:p>
@@ -1219,17 +837,18 @@
         <w:tblLook w:firstColumn="1" w:firstRow="1" w:lastColumn="0" w:lastRow="0" w:noHBand="0" w:noVBand="1" w:val="04A0"/>
       </w:tblPr>
       <w:tblGrid>
-        <w:gridCol w:w="1440"/>
-        <w:gridCol w:w="1440"/>
-        <w:gridCol w:w="1440"/>
-        <w:gridCol w:w="1440"/>
-        <w:gridCol w:w="1440"/>
-        <w:gridCol w:w="1440"/>
+        <w:gridCol w:w="1234"/>
+        <w:gridCol w:w="1234"/>
+        <w:gridCol w:w="1234"/>
+        <w:gridCol w:w="1234"/>
+        <w:gridCol w:w="1234"/>
+        <w:gridCol w:w="1234"/>
+        <w:gridCol w:w="1234"/>
       </w:tblGrid>
       <w:tr>
         <w:tc>
           <w:tcPr>
-            <w:tcW w:type="dxa" w:w="1440"/>
+            <w:tcW w:type="dxa" w:w="1234"/>
             <w:shd w:val="clear" w:fill="EAF0F6"/>
           </w:tcPr>
           <w:p>
@@ -1250,7 +869,7 @@
         </w:tc>
         <w:tc>
           <w:tcPr>
-            <w:tcW w:type="dxa" w:w="1440"/>
+            <w:tcW w:type="dxa" w:w="1234"/>
             <w:shd w:val="clear" w:fill="EAF0F6"/>
           </w:tcPr>
           <w:p>
@@ -1271,7 +890,7 @@
         </w:tc>
         <w:tc>
           <w:tcPr>
-            <w:tcW w:type="dxa" w:w="1440"/>
+            <w:tcW w:type="dxa" w:w="1234"/>
             <w:shd w:val="clear" w:fill="EAF0F6"/>
           </w:tcPr>
           <w:p>
@@ -1292,7 +911,7 @@
         </w:tc>
         <w:tc>
           <w:tcPr>
-            <w:tcW w:type="dxa" w:w="1440"/>
+            <w:tcW w:type="dxa" w:w="1234"/>
             <w:shd w:val="clear" w:fill="EAF0F6"/>
           </w:tcPr>
           <w:p>
@@ -1313,7 +932,7 @@
         </w:tc>
         <w:tc>
           <w:tcPr>
-            <w:tcW w:type="dxa" w:w="1440"/>
+            <w:tcW w:type="dxa" w:w="1234"/>
             <w:shd w:val="clear" w:fill="EAF0F6"/>
           </w:tcPr>
           <w:p>
@@ -1334,7 +953,28 @@
         </w:tc>
         <w:tc>
           <w:tcPr>
-            <w:tcW w:type="dxa" w:w="1440"/>
+            <w:tcW w:type="dxa" w:w="1234"/>
+            <w:shd w:val="clear" w:fill="EAF0F6"/>
+          </w:tcPr>
+          <w:p>
+            <w:r>
+              <w:rPr>
+                <w:b/>
+                <w:sz w:val="20"/>
+              </w:rPr>
+            </w:r>
+            <w:r>
+              <w:rPr>
+                <w:b/>
+                <w:sz w:val="20"/>
+              </w:rPr>
+              <w:t>Confidence</w:t>
+            </w:r>
+          </w:p>
+        </w:tc>
+        <w:tc>
+          <w:tcPr>
+            <w:tcW w:type="dxa" w:w="1234"/>
             <w:shd w:val="clear" w:fill="EAF0F6"/>
           </w:tcPr>
           <w:p>
@@ -1357,7 +997,291 @@
       <w:tr>
         <w:tc>
           <w:tcPr>
-            <w:tcW w:type="dxa" w:w="1440"/>
+            <w:tcW w:type="dxa" w:w="1234"/>
+          </w:tcPr>
+          <w:p>
+            <w:r>
+              <w:rPr>
+                <w:sz w:val="20"/>
+              </w:rPr>
+            </w:r>
+            <w:r>
+              <w:rPr>
+                <w:sz w:val="20"/>
+              </w:rPr>
+              <w:t>BYD ATTO 3 official specifications (export sheet)</w:t>
+            </w:r>
+          </w:p>
+        </w:tc>
+        <w:tc>
+          <w:tcPr>
+            <w:tcW w:type="dxa" w:w="1234"/>
+          </w:tcPr>
+          <w:p>
+            <w:r>
+              <w:rPr>
+                <w:sz w:val="20"/>
+              </w:rPr>
+            </w:r>
+            <w:r>
+              <w:rPr>
+                <w:sz w:val="20"/>
+              </w:rPr>
+              <w:t>BYD (</w:t>
+            </w:r>
+            <w:r>
+              <w:rPr>
+                <w:b/>
+                <w:sz w:val="20"/>
+              </w:rPr>
+              <w:t>manufacturer official</w:t>
+            </w:r>
+            <w:r>
+              <w:rPr>
+                <w:sz w:val="20"/>
+              </w:rPr>
+              <w:t>)</w:t>
+            </w:r>
+          </w:p>
+        </w:tc>
+        <w:tc>
+          <w:tcPr>
+            <w:tcW w:type="dxa" w:w="1234"/>
+          </w:tcPr>
+          <w:p>
+            <w:r>
+              <w:rPr>
+                <w:sz w:val="20"/>
+              </w:rPr>
+            </w:r>
+            <w:r>
+              <w:rPr>
+                <w:sz w:val="20"/>
+              </w:rPr>
+              <w:t>Export/RSA</w:t>
+            </w:r>
+          </w:p>
+        </w:tc>
+        <w:tc>
+          <w:tcPr>
+            <w:tcW w:type="dxa" w:w="1234"/>
+          </w:tcPr>
+          <w:p>
+            <w:r>
+              <w:rPr>
+                <w:sz w:val="20"/>
+              </w:rPr>
+            </w:r>
+            <w:r>
+              <w:rPr>
+                <w:sz w:val="20"/>
+              </w:rPr>
+              <w:t>https://www.byd.com/content/dam/byd-site/za/product/atto3/attopdf/Spec%20doc_RSA.pdf</w:t>
+            </w:r>
+          </w:p>
+        </w:tc>
+        <w:tc>
+          <w:tcPr>
+            <w:tcW w:type="dxa" w:w="1234"/>
+          </w:tcPr>
+          <w:p>
+            <w:r>
+              <w:rPr>
+                <w:sz w:val="20"/>
+              </w:rPr>
+            </w:r>
+            <w:r>
+              <w:rPr>
+                <w:sz w:val="20"/>
+              </w:rPr>
+              <w:t>2026-09-03</w:t>
+            </w:r>
+          </w:p>
+        </w:tc>
+        <w:tc>
+          <w:tcPr>
+            <w:tcW w:type="dxa" w:w="1234"/>
+          </w:tcPr>
+          <w:p>
+            <w:r>
+              <w:rPr>
+                <w:sz w:val="20"/>
+              </w:rPr>
+            </w:r>
+            <w:r>
+              <w:rPr>
+                <w:b/>
+                <w:sz w:val="20"/>
+              </w:rPr>
+              <w:t>VERIFIED</w:t>
+            </w:r>
+          </w:p>
+        </w:tc>
+        <w:tc>
+          <w:tcPr>
+            <w:tcW w:type="dxa" w:w="1234"/>
+          </w:tcPr>
+          <w:p>
+            <w:r>
+              <w:rPr>
+                <w:sz w:val="20"/>
+              </w:rPr>
+            </w:r>
+            <w:r>
+              <w:rPr>
+                <w:sz w:val="20"/>
+              </w:rPr>
+              <w:t>Dimensions 4455/1875, Blade 49.92/60.48, PMSM, WLTP 345/420</w:t>
+            </w:r>
+          </w:p>
+        </w:tc>
+      </w:tr>
+      <w:tr>
+        <w:tc>
+          <w:tcPr>
+            <w:tcW w:type="dxa" w:w="1234"/>
+          </w:tcPr>
+          <w:p>
+            <w:r>
+              <w:rPr>
+                <w:sz w:val="20"/>
+              </w:rPr>
+            </w:r>
+            <w:r>
+              <w:rPr>
+                <w:sz w:val="20"/>
+              </w:rPr>
+              <w:t>BYD ATTO 3 official spec sheet (NEDC)</w:t>
+            </w:r>
+          </w:p>
+        </w:tc>
+        <w:tc>
+          <w:tcPr>
+            <w:tcW w:type="dxa" w:w="1234"/>
+          </w:tcPr>
+          <w:p>
+            <w:r>
+              <w:rPr>
+                <w:sz w:val="20"/>
+              </w:rPr>
+            </w:r>
+            <w:r>
+              <w:rPr>
+                <w:sz w:val="20"/>
+              </w:rPr>
+              <w:t>BYD (</w:t>
+            </w:r>
+            <w:r>
+              <w:rPr>
+                <w:b/>
+                <w:sz w:val="20"/>
+              </w:rPr>
+              <w:t>manufacturer official</w:t>
+            </w:r>
+            <w:r>
+              <w:rPr>
+                <w:sz w:val="20"/>
+              </w:rPr>
+              <w:t>)</w:t>
+            </w:r>
+          </w:p>
+        </w:tc>
+        <w:tc>
+          <w:tcPr>
+            <w:tcW w:type="dxa" w:w="1234"/>
+          </w:tcPr>
+          <w:p>
+            <w:r>
+              <w:rPr>
+                <w:sz w:val="20"/>
+              </w:rPr>
+            </w:r>
+            <w:r>
+              <w:rPr>
+                <w:sz w:val="20"/>
+              </w:rPr>
+              <w:t>Export/HK</w:t>
+            </w:r>
+          </w:p>
+        </w:tc>
+        <w:tc>
+          <w:tcPr>
+            <w:tcW w:type="dxa" w:w="1234"/>
+          </w:tcPr>
+          <w:p>
+            <w:r>
+              <w:rPr>
+                <w:sz w:val="20"/>
+              </w:rPr>
+            </w:r>
+            <w:r>
+              <w:rPr>
+                <w:sz w:val="20"/>
+              </w:rPr>
+              <w:t>https://www.byd.com/content/dam/byd-site/hk/product/new-atto3/pc/SPECS-en.pdf</w:t>
+            </w:r>
+          </w:p>
+        </w:tc>
+        <w:tc>
+          <w:tcPr>
+            <w:tcW w:type="dxa" w:w="1234"/>
+          </w:tcPr>
+          <w:p>
+            <w:r>
+              <w:rPr>
+                <w:sz w:val="20"/>
+              </w:rPr>
+            </w:r>
+            <w:r>
+              <w:rPr>
+                <w:sz w:val="20"/>
+              </w:rPr>
+              <w:t>2026-09-03</w:t>
+            </w:r>
+          </w:p>
+        </w:tc>
+        <w:tc>
+          <w:tcPr>
+            <w:tcW w:type="dxa" w:w="1234"/>
+          </w:tcPr>
+          <w:p>
+            <w:r>
+              <w:rPr>
+                <w:sz w:val="20"/>
+              </w:rPr>
+            </w:r>
+            <w:r>
+              <w:rPr>
+                <w:b/>
+                <w:sz w:val="20"/>
+              </w:rPr>
+              <w:t>VERIFIED</w:t>
+            </w:r>
+          </w:p>
+        </w:tc>
+        <w:tc>
+          <w:tcPr>
+            <w:tcW w:type="dxa" w:w="1234"/>
+          </w:tcPr>
+          <w:p>
+            <w:r>
+              <w:rPr>
+                <w:sz w:val="20"/>
+              </w:rPr>
+            </w:r>
+            <w:r>
+              <w:rPr>
+                <w:sz w:val="20"/>
+              </w:rPr>
+              <w:t>NEDC 410/480, battery capacities, export configuration</w:t>
+            </w:r>
+          </w:p>
+        </w:tc>
+      </w:tr>
+      <w:tr>
+        <w:tc>
+          <w:tcPr>
+            <w:tcW w:type="dxa" w:w="1234"/>
           </w:tcPr>
           <w:p>
             <w:r>
@@ -1375,7 +1299,7 @@
         </w:tc>
         <w:tc>
           <w:tcPr>
-            <w:tcW w:type="dxa" w:w="1440"/>
+            <w:tcW w:type="dxa" w:w="1234"/>
           </w:tcPr>
           <w:p>
             <w:r>
@@ -1387,13 +1311,13 @@
               <w:rPr>
                 <w:sz w:val="20"/>
               </w:rPr>
-              <w:t>ZOL Auto (中关村在线)</w:t>
+              <w:t>ZOL Auto</w:t>
             </w:r>
           </w:p>
         </w:tc>
         <w:tc>
           <w:tcPr>
-            <w:tcW w:type="dxa" w:w="1440"/>
+            <w:tcW w:type="dxa" w:w="1234"/>
           </w:tcPr>
           <w:p>
             <w:r>
@@ -1411,7 +1335,7 @@
         </w:tc>
         <w:tc>
           <w:tcPr>
-            <w:tcW w:type="dxa" w:w="1440"/>
+            <w:tcW w:type="dxa" w:w="1234"/>
           </w:tcPr>
           <w:p>
             <w:r>
@@ -1429,7 +1353,7 @@
         </w:tc>
         <w:tc>
           <w:tcPr>
-            <w:tcW w:type="dxa" w:w="1440"/>
+            <w:tcW w:type="dxa" w:w="1234"/>
           </w:tcPr>
           <w:p>
             <w:r>
@@ -1447,7 +1371,7 @@
         </w:tc>
         <w:tc>
           <w:tcPr>
-            <w:tcW w:type="dxa" w:w="1440"/>
+            <w:tcW w:type="dxa" w:w="1234"/>
           </w:tcPr>
           <w:p>
             <w:r>
@@ -1459,7 +1383,25 @@
               <w:rPr>
                 <w:sz w:val="20"/>
               </w:rPr>
-              <w:t>Dimensions, wheelbase, charging power, top speed, ADAS/infotainment</w:t>
+              <w:t>CROSS_CHECKED</w:t>
+            </w:r>
+          </w:p>
+        </w:tc>
+        <w:tc>
+          <w:tcPr>
+            <w:tcW w:type="dxa" w:w="1234"/>
+          </w:tcPr>
+          <w:p>
+            <w:r>
+              <w:rPr>
+                <w:sz w:val="20"/>
+              </w:rPr>
+            </w:r>
+            <w:r>
+              <w:rPr>
+                <w:sz w:val="20"/>
+              </w:rPr>
+              <w:t>China dimensions, charging power, ADAS/infotainment</w:t>
             </w:r>
           </w:p>
         </w:tc>
@@ -1467,7 +1409,7 @@
       <w:tr>
         <w:tc>
           <w:tcPr>
-            <w:tcW w:type="dxa" w:w="1440"/>
+            <w:tcW w:type="dxa" w:w="1234"/>
           </w:tcPr>
           <w:p>
             <w:r>
@@ -1485,7 +1427,7 @@
         </w:tc>
         <w:tc>
           <w:tcPr>
-            <w:tcW w:type="dxa" w:w="1440"/>
+            <w:tcW w:type="dxa" w:w="1234"/>
           </w:tcPr>
           <w:p>
             <w:r>
@@ -1497,13 +1439,13 @@
               <w:rPr>
                 <w:sz w:val="20"/>
               </w:rPr>
-              <w:t>Dongchedi (懂车帝, ByteDance)</w:t>
+              <w:t>Dongchedi (懂车帝)</w:t>
             </w:r>
           </w:p>
         </w:tc>
         <w:tc>
           <w:tcPr>
-            <w:tcW w:type="dxa" w:w="1440"/>
+            <w:tcW w:type="dxa" w:w="1234"/>
           </w:tcPr>
           <w:p>
             <w:r>
@@ -1521,7 +1463,7 @@
         </w:tc>
         <w:tc>
           <w:tcPr>
-            <w:tcW w:type="dxa" w:w="1440"/>
+            <w:tcW w:type="dxa" w:w="1234"/>
           </w:tcPr>
           <w:p>
             <w:r>
@@ -1539,7 +1481,7 @@
         </w:tc>
         <w:tc>
           <w:tcPr>
-            <w:tcW w:type="dxa" w:w="1440"/>
+            <w:tcW w:type="dxa" w:w="1234"/>
           </w:tcPr>
           <w:p>
             <w:r>
@@ -1557,7 +1499,7 @@
         </w:tc>
         <w:tc>
           <w:tcPr>
-            <w:tcW w:type="dxa" w:w="1440"/>
+            <w:tcW w:type="dxa" w:w="1234"/>
           </w:tcPr>
           <w:p>
             <w:r>
@@ -1569,7 +1511,25 @@
               <w:rPr>
                 <w:sz w:val="20"/>
               </w:rPr>
-              <w:t>150 kW/310 N·m motor, 60.48 kWh, CLTC 510 km, 7.3 s</w:t>
+              <w:t>CROSS_CHECKED</w:t>
+            </w:r>
+          </w:p>
+        </w:tc>
+        <w:tc>
+          <w:tcPr>
+            <w:tcW w:type="dxa" w:w="1234"/>
+          </w:tcPr>
+          <w:p>
+            <w:r>
+              <w:rPr>
+                <w:sz w:val="20"/>
+              </w:rPr>
+            </w:r>
+            <w:r>
+              <w:rPr>
+                <w:sz w:val="20"/>
+              </w:rPr>
+              <w:t>150 kW/310 N·m, 60.48 kWh, CLTC 510, 7.3 s</w:t>
             </w:r>
           </w:p>
         </w:tc>
@@ -1577,7 +1537,7 @@
       <w:tr>
         <w:tc>
           <w:tcPr>
-            <w:tcW w:type="dxa" w:w="1440"/>
+            <w:tcW w:type="dxa" w:w="1234"/>
           </w:tcPr>
           <w:p>
             <w:r>
@@ -1595,7 +1555,7 @@
         </w:tc>
         <w:tc>
           <w:tcPr>
-            <w:tcW w:type="dxa" w:w="1440"/>
+            <w:tcW w:type="dxa" w:w="1234"/>
           </w:tcPr>
           <w:p>
             <w:r>
@@ -1613,7 +1573,7 @@
         </w:tc>
         <w:tc>
           <w:tcPr>
-            <w:tcW w:type="dxa" w:w="1440"/>
+            <w:tcW w:type="dxa" w:w="1234"/>
           </w:tcPr>
           <w:p>
             <w:r>
@@ -1631,7 +1591,7 @@
         </w:tc>
         <w:tc>
           <w:tcPr>
-            <w:tcW w:type="dxa" w:w="1440"/>
+            <w:tcW w:type="dxa" w:w="1234"/>
           </w:tcPr>
           <w:p>
             <w:r>
@@ -1649,7 +1609,7 @@
         </w:tc>
         <w:tc>
           <w:tcPr>
-            <w:tcW w:type="dxa" w:w="1440"/>
+            <w:tcW w:type="dxa" w:w="1234"/>
           </w:tcPr>
           <w:p>
             <w:r>
@@ -1667,7 +1627,7 @@
         </w:tc>
         <w:tc>
           <w:tcPr>
-            <w:tcW w:type="dxa" w:w="1440"/>
+            <w:tcW w:type="dxa" w:w="1234"/>
           </w:tcPr>
           <w:p>
             <w:r>
@@ -1679,15 +1639,13 @@
               <w:rPr>
                 <w:sz w:val="20"/>
               </w:rPr>
-              <w:t>Motor, battery variants, launch/price context</w:t>
+              <w:t>CROSS_CHECKED</w:t>
             </w:r>
           </w:p>
         </w:tc>
-      </w:tr>
-      <w:tr>
         <w:tc>
           <w:tcPr>
-            <w:tcW w:type="dxa" w:w="1440"/>
+            <w:tcW w:type="dxa" w:w="1234"/>
           </w:tcPr>
           <w:p>
             <w:r>
@@ -1699,207 +1657,7 @@
               <w:rPr>
                 <w:sz w:val="20"/>
               </w:rPr>
-              <w:t>Yuan Plus config page</w:t>
-            </w:r>
-          </w:p>
-        </w:tc>
-        <w:tc>
-          <w:tcPr>
-            <w:tcW w:type="dxa" w:w="1440"/>
-          </w:tcPr>
-          <w:p>
-            <w:r>
-              <w:rPr>
-                <w:sz w:val="20"/>
-              </w:rPr>
-            </w:r>
-            <w:r>
-              <w:rPr>
-                <w:sz w:val="20"/>
-              </w:rPr>
-              <w:t>PCauto (太平洋汽车)</w:t>
-            </w:r>
-          </w:p>
-        </w:tc>
-        <w:tc>
-          <w:tcPr>
-            <w:tcW w:type="dxa" w:w="1440"/>
-          </w:tcPr>
-          <w:p>
-            <w:r>
-              <w:rPr>
-                <w:sz w:val="20"/>
-              </w:rPr>
-            </w:r>
-            <w:r>
-              <w:rPr>
-                <w:sz w:val="20"/>
-              </w:rPr>
-              <w:t>CN</w:t>
-            </w:r>
-          </w:p>
-        </w:tc>
-        <w:tc>
-          <w:tcPr>
-            <w:tcW w:type="dxa" w:w="1440"/>
-          </w:tcPr>
-          <w:p>
-            <w:r>
-              <w:rPr>
-                <w:sz w:val="20"/>
-              </w:rPr>
-            </w:r>
-            <w:r>
-              <w:rPr>
-                <w:sz w:val="20"/>
-              </w:rPr>
-              <w:t>https://price.pcauto.com.cn/s48082/config.html</w:t>
-            </w:r>
-          </w:p>
-        </w:tc>
-        <w:tc>
-          <w:tcPr>
-            <w:tcW w:type="dxa" w:w="1440"/>
-          </w:tcPr>
-          <w:p>
-            <w:r>
-              <w:rPr>
-                <w:sz w:val="20"/>
-              </w:rPr>
-            </w:r>
-            <w:r>
-              <w:rPr>
-                <w:sz w:val="20"/>
-              </w:rPr>
-              <w:t>2026-09-02</w:t>
-            </w:r>
-          </w:p>
-        </w:tc>
-        <w:tc>
-          <w:tcPr>
-            <w:tcW w:type="dxa" w:w="1440"/>
-          </w:tcPr>
-          <w:p>
-            <w:r>
-              <w:rPr>
-                <w:sz w:val="20"/>
-              </w:rPr>
-            </w:r>
-            <w:r>
-              <w:rPr>
-                <w:sz w:val="20"/>
-              </w:rPr>
-              <w:t>204 PS, fast-charge detail</w:t>
-            </w:r>
-          </w:p>
-        </w:tc>
-      </w:tr>
-      <w:tr>
-        <w:tc>
-          <w:tcPr>
-            <w:tcW w:type="dxa" w:w="1440"/>
-          </w:tcPr>
-          <w:p>
-            <w:r>
-              <w:rPr>
-                <w:sz w:val="20"/>
-              </w:rPr>
-            </w:r>
-            <w:r>
-              <w:rPr>
-                <w:sz w:val="20"/>
-              </w:rPr>
-              <w:t>Glory Edition launch news</w:t>
-            </w:r>
-          </w:p>
-        </w:tc>
-        <w:tc>
-          <w:tcPr>
-            <w:tcW w:type="dxa" w:w="1440"/>
-          </w:tcPr>
-          <w:p>
-            <w:r>
-              <w:rPr>
-                <w:sz w:val="20"/>
-              </w:rPr>
-            </w:r>
-            <w:r>
-              <w:rPr>
-                <w:sz w:val="20"/>
-              </w:rPr>
-              <w:t>Autohome Chejiahao</w:t>
-            </w:r>
-          </w:p>
-        </w:tc>
-        <w:tc>
-          <w:tcPr>
-            <w:tcW w:type="dxa" w:w="1440"/>
-          </w:tcPr>
-          <w:p>
-            <w:r>
-              <w:rPr>
-                <w:sz w:val="20"/>
-              </w:rPr>
-            </w:r>
-            <w:r>
-              <w:rPr>
-                <w:sz w:val="20"/>
-              </w:rPr>
-              <w:t>CN</w:t>
-            </w:r>
-          </w:p>
-        </w:tc>
-        <w:tc>
-          <w:tcPr>
-            <w:tcW w:type="dxa" w:w="1440"/>
-          </w:tcPr>
-          <w:p>
-            <w:r>
-              <w:rPr>
-                <w:sz w:val="20"/>
-              </w:rPr>
-            </w:r>
-            <w:r>
-              <w:rPr>
-                <w:sz w:val="20"/>
-              </w:rPr>
-              <w:t>https://chejiahao.m.autohome.com.cn/info/14756991</w:t>
-            </w:r>
-          </w:p>
-        </w:tc>
-        <w:tc>
-          <w:tcPr>
-            <w:tcW w:type="dxa" w:w="1440"/>
-          </w:tcPr>
-          <w:p>
-            <w:r>
-              <w:rPr>
-                <w:sz w:val="20"/>
-              </w:rPr>
-            </w:r>
-            <w:r>
-              <w:rPr>
-                <w:sz w:val="20"/>
-              </w:rPr>
-              <w:t>2026-09-02</w:t>
-            </w:r>
-          </w:p>
-        </w:tc>
-        <w:tc>
-          <w:tcPr>
-            <w:tcW w:type="dxa" w:w="1440"/>
-          </w:tcPr>
-          <w:p>
-            <w:r>
-              <w:rPr>
-                <w:sz w:val="20"/>
-              </w:rPr>
-            </w:r>
-            <w:r>
-              <w:rPr>
-                <w:sz w:val="20"/>
-              </w:rPr>
-              <w:t>March 2024 launch; domestic guide price (reference only)</w:t>
+              <w:t>Motor, battery variants, launch context</w:t>
             </w:r>
           </w:p>
         </w:tc>
@@ -1910,7 +1668,7 @@
         <w:rPr>
           <w:i/>
         </w:rPr>
-        <w:t>Verification note: core specifications are CROSS_CHECKED across ZOL/Dongchedi/Autohome. A single BYD brand-official China spec sheet was not captured in Stage 1; export-market Atto 3 figures must be confirmed against BYD destination-market official material and are not asserted here.</w:t>
+        <w:t>Confidence note: battery type/capacity, dimensions, motor layout and export WLTP/NEDC ranges are VERIFIED on BYD's own sheets; China CLTC labels and domestic charge peaks are CROSS_CHECKED across Chinese databases. Chinese and export figures are presented separately by cycle and never merged into a "global spec".</w:t>
       </w:r>
     </w:p>
     <w:p>
@@ -1929,10 +1687,10 @@
         <w:rPr>
           <w:b/>
         </w:rPr>
-        <w:t>Reviewed by</w:t>
+        <w:t>Author / reviewer</w:t>
       </w:r>
       <w:r>
-        <w:t>: AutoBridge Export Sourcing Team</w:t>
+        <w:t>: [AutoBridge Export Sourcing Team](/authors/autobridge-export-sourcing-team/) · method per our [Editorial Policy](/about/editorial-policy/)</w:t>
       </w:r>
     </w:p>
     <w:p>
@@ -1946,7 +1704,16 @@
         <w:t>Last reviewed</w:t>
       </w:r>
       <w:r>
-        <w:t>: 2026-09-02</w:t>
+        <w:t xml:space="preserve">: 2026-09-02 · </w:t>
+      </w:r>
+      <w:r>
+        <w:rPr>
+          <w:b/>
+        </w:rPr>
+        <w:t>Second-round source revision</w:t>
+      </w:r>
+      <w:r>
+        <w:t>: 2026-09-03 (BYD-official export sheets added; CLTC/WLTP/NEDC split made explicit; URL made evergreen)</w:t>
       </w:r>
     </w:p>
     <w:p>
@@ -1960,7 +1727,7 @@
         <w:t>Reference market</w:t>
       </w:r>
       <w:r>
-        <w:t>: China (2024 Glory Edition); export name BYD Atto 3</w:t>
+        <w:t>: China 2024 Glory Edition; export name BYD Atto 3 (destination sheets govern export builds)</w:t>
       </w:r>
     </w:p>
     <w:p>
@@ -1974,7 +1741,7 @@
         <w:t>Verification method</w:t>
       </w:r>
       <w:r>
-        <w:t>: Multi-database cross-check (≥2 independent sources per key spec); domestic price flagged time-sensitive reference only</w:t>
+        <w:t>: Manufacturer-official export sheets + multi-database China cross-check; range always labelled by test cycle</w:t>
       </w:r>
     </w:p>
     <w:p>
@@ -1985,10 +1752,10 @@
         <w:rPr>
           <w:b/>
         </w:rPr>
-        <w:t>Content status</w:t>
+        <w:t>Quality gates</w:t>
       </w:r>
       <w:r>
-        <w:t>: QA_PASS (Master/EN only; queued for later multilingual localization)</w:t>
+        <w:t>: EDITORIAL_QA_PASS=PASS · FACT_SOURCE_PASS=PASS (OEM source added) · SEO_PASS=PASS (evergreen URL) · CODEX_REVIEW_PASS=PENDING (independent Codex review) · PUBLISH_APPROVED=FALSE until Codex sign-off</w:t>
       </w:r>
     </w:p>
     <w:sectPr>

</xml_diff>

<commit_message>
Third-round targeted fixes 2026-09-02: live internal links, de-claimed value-add blocks, V01/V03/G01/G02/G04/G07/G08 fact-boundary fixes, 5 permanent lessons, R3 QA report; all 20 -> CODEX_REVIEW_PENDING (no self-approval)
</commit_message>
<xml_diff>
--- a/deliveries/2026-09-02/01_Vehicle_Pages/VEH_20260902_01_BYD_Yuan_Plus_2024.docx
+++ b/deliveries/2026-09-02/01_Vehicle_Pages/VEH_20260902_01_BYD_Yuan_Plus_2024.docx
@@ -290,7 +290,22 @@
                 <w:b/>
                 <w:sz w:val="20"/>
               </w:rPr>
-              <w:t>Export Atto 3 equivalent (BYD-official)</w:t>
+              <w:t xml:space="preserve">Regional Atto 3 reference — same </w:t>
+            </w:r>
+            <w:r>
+              <w:rPr>
+                <w:b/>
+                <w:i/>
+                <w:sz w:val="20"/>
+              </w:rPr>
+              <w:t>nominal</w:t>
+            </w:r>
+            <w:r>
+              <w:rPr>
+                <w:b/>
+                <w:sz w:val="20"/>
+              </w:rPr>
+              <w:t xml:space="preserve"> battery capacity (BYD-official, market-specific)</w:t>
             </w:r>
           </w:p>
         </w:tc>
@@ -364,7 +379,7 @@
               <w:rPr>
                 <w:sz w:val="20"/>
               </w:rPr>
-              <w:t>WLTP 345 km / NEDC 410 km</w:t>
+              <w:t>Regional Atto 3 builds with a nominal 49.92 kWh pack: WLTP ≈345 km / NEDC ≈410 km</w:t>
             </w:r>
           </w:p>
         </w:tc>
@@ -438,7 +453,7 @@
               <w:rPr>
                 <w:sz w:val="20"/>
               </w:rPr>
-              <w:t>WLTP 420 km / NEDC 480 km</w:t>
+              <w:t>Regional Atto 3 builds with a nominal 60.48 kWh pack: WLTP ≈420 km / NEDC ≈480 km</w:t>
             </w:r>
           </w:p>
         </w:tc>
@@ -455,7 +470,16 @@
         <w:t>BYD's own export specification sheets (VERIFIED)</w:t>
       </w:r>
       <w:r>
-        <w:t>; the China CLTC 430/510 labels are cross-checked across Chinese databases (CROSS_CHECKED). Higher grades add the DiPilot assist package and the larger rotating screen — record the exact Chinese grade name, because a "510" label can attach to several equipment levels.</w:t>
+        <w:t xml:space="preserve">; the China CLTC 430/510 labels are cross-checked across Chinese databases (CROSS_CHECKED). </w:t>
+      </w:r>
+      <w:r>
+        <w:rPr>
+          <w:b/>
+        </w:rPr>
+        <w:t>These Atto 3 figures are a regional reference matched only by nominal battery capacity — they are not one-to-one trim equivalents of the China 430/510 grades</w:t>
+      </w:r>
+      <w:r>
+        <w:t>: certified range, power, equipment and even charge figures differ by country/region, so confirm the exact destination-market spec sheet for the VIN. Higher grades add the DiPilot assist package and the larger rotating screen — record the exact Chinese grade name, because a "510" label can attach to several equipment levels.</w:t>
       </w:r>
     </w:p>
     <w:p>
@@ -633,16 +657,7 @@
     </w:p>
     <w:p>
       <w:r>
-        <w:t xml:space="preserve">Spec sites list Chinese numbers in isolation and leave the buyer to reconcile them with export reality. AutoBridge supplies a </w:t>
-      </w:r>
-      <w:r>
-        <w:rPr>
-          <w:b/>
-        </w:rPr>
-        <w:t>single build sheet that pairs each VIN's battery size with BOTH its CLTC label and the destination-market WLTP/NEDC figure</w:t>
-      </w:r>
-      <w:r>
-        <w:t>, flags GB/T-vs-CCS inlet before deposit, and records the exact Chinese grade so a "510" cannot be substituted by a lower-equipped car. That version-and-cycle reconciliation is the value a raw spec table does not provide.</w:t>
+        <w:t>Spec sites list Chinese numbers in isolation and leave the buyer to reconcile them with export reality. This guide recommends a single build note pairing each VIN's battery size with BOTH its CLTC label and the destination-market WLTP/NEDC figure, confirming GB/T-vs-destination inlet before deposit, and recording the exact Chinese grade so a "510" label is not substituted by a lower-equipped car. That version-and-cycle reconciliation is the value a raw spec table does not provide.</w:t>
       </w:r>
     </w:p>
     <w:p>
@@ -1690,7 +1705,7 @@
         <w:t>Author / reviewer</w:t>
       </w:r>
       <w:r>
-        <w:t>: [AutoBridge Export Sourcing Team](/authors/autobridge-export-sourcing-team/) · method per our [Editorial Policy](/about/editorial-policy/)</w:t>
+        <w:t>: [AutoBridge Export Sourcing Team](/authors/) · method per our [Editorial Policy](/editorial-policy/)</w:t>
       </w:r>
     </w:p>
     <w:p>
@@ -1705,6 +1720,15 @@
       </w:r>
       <w:r>
         <w:t xml:space="preserve">: 2026-09-02 · </w:t>
+      </w:r>
+      <w:r>
+        <w:rPr>
+          <w:b/>
+        </w:rPr>
+        <w:t>R3 (2026-09-03): Atto 3 reframed as regional same-nominal-capacity reference, not 1:1 China-trim equivalent</w:t>
+      </w:r>
+      <w:r>
+        <w:t xml:space="preserve"> · </w:t>
       </w:r>
       <w:r>
         <w:rPr>

</xml_diff>

<commit_message>
Repair existing AutoBridge articles for 2026-09-02 to 2026-09-04
</commit_message>
<xml_diff>
--- a/deliveries/2026-09-02/01_Vehicle_Pages/VEH_20260902_01_BYD_Yuan_Plus_2024.docx
+++ b/deliveries/2026-09-02/01_Vehicle_Pages/VEH_20260902_01_BYD_Yuan_Plus_2024.docx
@@ -4,7 +4,7 @@
   <w:body>
     <w:p>
       <w:pPr>
-        <w:pStyle w:val="Title"/>
+        <w:pStyle w:val="Heading1"/>
       </w:pPr>
       <w:r>
         <w:t>BYD Yuan Plus (Atto 3) — Battery, Range Cycle, Charging and Export Buyer Notes</w:t>
@@ -12,7 +12,7 @@
     </w:p>
     <w:p>
       <w:pPr>
-        <w:pStyle w:val="Heading1"/>
+        <w:pStyle w:val="Heading2"/>
       </w:pPr>
       <w:r>
         <w:t>SEO Metadata</w:t>
@@ -43,7 +43,7 @@
         <w:t>Meta Description</w:t>
       </w:r>
       <w:r>
-        <w:t>: Chinese-market BYD Yuan Plus (Atto 3) explained for exporters — 49.92/60.48 kWh Blade Battery, CLTC vs WLTP range side by side, GB/T vs CCS charging, DiLink software limits and what to verify by VIN.</w:t>
+        <w:t>: Chinese-market BYD Yuan Plus (Atto 3) explained for exporters — 49.92/60.48 kWh Blade Battery, why China CLTC must be kept separate from a destination's WLTP/NEDC figure, GB/T vs local charging inlet, and what to verify by VIN.</w:t>
       </w:r>
     </w:p>
     <w:p>
@@ -146,7 +146,7 @@
     </w:p>
     <w:p>
       <w:pPr>
-        <w:pStyle w:val="Heading1"/>
+        <w:pStyle w:val="Heading2"/>
       </w:pPr>
       <w:r>
         <w:t>Buyer Context: One Car, Two Specification Languages</w:t>
@@ -186,7 +186,7 @@
     </w:p>
     <w:p>
       <w:pPr>
-        <w:pStyle w:val="Heading1"/>
+        <w:pStyle w:val="Heading2"/>
       </w:pPr>
       <w:r>
         <w:t>Battery and Variants (the EV decision starts here)</w:t>
@@ -199,7 +199,7 @@
     </w:p>
     <w:tbl>
       <w:tblPr>
-        <w:tblStyle w:val="TableGrid"/>
+        <w:tblStyle w:val="LightGrid-Accent1"/>
         <w:tblW w:type="auto" w:w="0"/>
         <w:tblLook w:firstColumn="1" w:firstRow="1" w:lastColumn="0" w:lastRow="0" w:noHBand="0" w:noVBand="1" w:val="04A0"/>
       </w:tblPr>
@@ -213,20 +213,9 @@
         <w:tc>
           <w:tcPr>
             <w:tcW w:type="dxa" w:w="2160"/>
-            <w:shd w:val="clear" w:fill="EAF0F6"/>
           </w:tcPr>
           <w:p>
             <w:r>
-              <w:rPr>
-                <w:b/>
-                <w:sz w:val="20"/>
-              </w:rPr>
-            </w:r>
-            <w:r>
-              <w:rPr>
-                <w:b/>
-                <w:sz w:val="20"/>
-              </w:rPr>
               <w:t>China variant cue</w:t>
             </w:r>
           </w:p>
@@ -234,20 +223,9 @@
         <w:tc>
           <w:tcPr>
             <w:tcW w:type="dxa" w:w="2160"/>
-            <w:shd w:val="clear" w:fill="EAF0F6"/>
           </w:tcPr>
           <w:p>
             <w:r>
-              <w:rPr>
-                <w:b/>
-                <w:sz w:val="20"/>
-              </w:rPr>
-            </w:r>
-            <w:r>
-              <w:rPr>
-                <w:b/>
-                <w:sz w:val="20"/>
-              </w:rPr>
               <w:t>Blade Battery (LFP)</w:t>
             </w:r>
           </w:p>
@@ -255,20 +233,9 @@
         <w:tc>
           <w:tcPr>
             <w:tcW w:type="dxa" w:w="2160"/>
-            <w:shd w:val="clear" w:fill="EAF0F6"/>
           </w:tcPr>
           <w:p>
             <w:r>
-              <w:rPr>
-                <w:b/>
-                <w:sz w:val="20"/>
-              </w:rPr>
-            </w:r>
-            <w:r>
-              <w:rPr>
-                <w:b/>
-                <w:sz w:val="20"/>
-              </w:rPr>
               <w:t>China CLTC range</w:t>
             </w:r>
           </w:p>
@@ -276,36 +243,10 @@
         <w:tc>
           <w:tcPr>
             <w:tcW w:type="dxa" w:w="2160"/>
-            <w:shd w:val="clear" w:fill="EAF0F6"/>
           </w:tcPr>
           <w:p>
             <w:r>
-              <w:rPr>
-                <w:b/>
-                <w:sz w:val="20"/>
-              </w:rPr>
-            </w:r>
-            <w:r>
-              <w:rPr>
-                <w:b/>
-                <w:sz w:val="20"/>
-              </w:rPr>
-              <w:t xml:space="preserve">Regional Atto 3 reference — same </w:t>
-            </w:r>
-            <w:r>
-              <w:rPr>
-                <w:b/>
-                <w:i/>
-                <w:sz w:val="20"/>
-              </w:rPr>
-              <w:t>nominal</w:t>
-            </w:r>
-            <w:r>
-              <w:rPr>
-                <w:b/>
-                <w:sz w:val="20"/>
-              </w:rPr>
-              <w:t xml:space="preserve"> battery capacity (BYD-official, market-specific)</w:t>
+              <w:t>Regional Atto 3 reference — same *nominal* battery capacity (BYD-official, market-specific)</w:t>
             </w:r>
           </w:p>
         </w:tc>
@@ -317,14 +258,6 @@
           </w:tcPr>
           <w:p>
             <w:r>
-              <w:rPr>
-                <w:sz w:val="20"/>
-              </w:rPr>
-            </w:r>
-            <w:r>
-              <w:rPr>
-                <w:sz w:val="20"/>
-              </w:rPr>
               <w:t>430 version</w:t>
             </w:r>
           </w:p>
@@ -335,14 +268,6 @@
           </w:tcPr>
           <w:p>
             <w:r>
-              <w:rPr>
-                <w:sz w:val="20"/>
-              </w:rPr>
-            </w:r>
-            <w:r>
-              <w:rPr>
-                <w:sz w:val="20"/>
-              </w:rPr>
               <w:t>49.92 kWh</w:t>
             </w:r>
           </w:p>
@@ -353,14 +278,6 @@
           </w:tcPr>
           <w:p>
             <w:r>
-              <w:rPr>
-                <w:sz w:val="20"/>
-              </w:rPr>
-            </w:r>
-            <w:r>
-              <w:rPr>
-                <w:sz w:val="20"/>
-              </w:rPr>
               <w:t>430 km CLTC</w:t>
             </w:r>
           </w:p>
@@ -371,15 +288,7 @@
           </w:tcPr>
           <w:p>
             <w:r>
-              <w:rPr>
-                <w:sz w:val="20"/>
-              </w:rPr>
-            </w:r>
-            <w:r>
-              <w:rPr>
-                <w:sz w:val="20"/>
-              </w:rPr>
-              <w:t>Regional Atto 3 builds with a nominal 49.92 kWh pack: WLTP ≈345 km / NEDC ≈410 km</w:t>
+              <w:t>Regional Atto 3 builds share this nominal pack class, but export range is set by the destination test cycle — obtain the current official BYD regional sheet; do not convert CLTC</w:t>
             </w:r>
           </w:p>
         </w:tc>
@@ -391,14 +300,6 @@
           </w:tcPr>
           <w:p>
             <w:r>
-              <w:rPr>
-                <w:sz w:val="20"/>
-              </w:rPr>
-            </w:r>
-            <w:r>
-              <w:rPr>
-                <w:sz w:val="20"/>
-              </w:rPr>
               <w:t>510 version (e.g., 510KM 领先型)</w:t>
             </w:r>
           </w:p>
@@ -409,14 +310,6 @@
           </w:tcPr>
           <w:p>
             <w:r>
-              <w:rPr>
-                <w:sz w:val="20"/>
-              </w:rPr>
-            </w:r>
-            <w:r>
-              <w:rPr>
-                <w:sz w:val="20"/>
-              </w:rPr>
               <w:t>60.48 kWh</w:t>
             </w:r>
           </w:p>
@@ -427,14 +320,6 @@
           </w:tcPr>
           <w:p>
             <w:r>
-              <w:rPr>
-                <w:sz w:val="20"/>
-              </w:rPr>
-            </w:r>
-            <w:r>
-              <w:rPr>
-                <w:sz w:val="20"/>
-              </w:rPr>
               <w:t>510 km CLTC</w:t>
             </w:r>
           </w:p>
@@ -445,20 +330,13 @@
           </w:tcPr>
           <w:p>
             <w:r>
-              <w:rPr>
-                <w:sz w:val="20"/>
-              </w:rPr>
-            </w:r>
-            <w:r>
-              <w:rPr>
-                <w:sz w:val="20"/>
-              </w:rPr>
-              <w:t>Regional Atto 3 builds with a nominal 60.48 kWh pack: WLTP ≈420 km / NEDC ≈480 km</w:t>
+              <w:t>Same nominal pack class as the higher regional Atto 3 build; the export-market figure depends on cycle and model year and must be read from that market's current official sheet, not derived from 510 CLTC</w:t>
             </w:r>
           </w:p>
         </w:tc>
       </w:tr>
     </w:tbl>
+    <w:p/>
     <w:p>
       <w:r>
         <w:t xml:space="preserve">Battery capacities and the LFP Blade type are confirmed on </w:t>
@@ -484,7 +362,7 @@
     </w:p>
     <w:p>
       <w:pPr>
-        <w:pStyle w:val="Heading1"/>
+        <w:pStyle w:val="Heading2"/>
       </w:pPr>
       <w:r>
         <w:t>Powertrain</w:t>
@@ -506,7 +384,7 @@
     </w:p>
     <w:p>
       <w:pPr>
-        <w:pStyle w:val="Heading1"/>
+        <w:pStyle w:val="Heading2"/>
       </w:pPr>
       <w:r>
         <w:t>Range Cycle: Never Present CLTC as WLTP</w:t>
@@ -514,48 +392,30 @@
     </w:p>
     <w:p>
       <w:r>
-        <w:t xml:space="preserve">This is where importers most often mis-spec a car. The </w:t>
+        <w:t xml:space="preserve">This is where importers most often mis-spec a car. The same physical pack carries a </w:t>
       </w:r>
       <w:r>
         <w:rPr>
           <w:b/>
         </w:rPr>
-        <w:t>same 60.48 kWh pack</w:t>
+        <w:t>higher number under China CLTC than under the NEDC or the more conservative WLTP</w:t>
       </w:r>
       <w:r>
-        <w:t xml:space="preserve"> is labelled 510 km under China </w:t>
+        <w:t xml:space="preserve"> used in Europe/Australia, and the exact destination figure also moves with model year and regional tuning. Always quote the cycle next to the number, request the </w:t>
       </w:r>
       <w:r>
         <w:rPr>
           <w:b/>
         </w:rPr>
-        <w:t>CLTC</w:t>
+        <w:t>destination-certified figure from BYD's current official regional page</w:t>
       </w:r>
       <w:r>
-        <w:t xml:space="preserve">, 480 km under </w:t>
-      </w:r>
-      <w:r>
-        <w:rPr>
-          <w:b/>
-        </w:rPr>
-        <w:t>NEDC</w:t>
-      </w:r>
-      <w:r>
-        <w:t xml:space="preserve"> and 420 km under the more conservative </w:t>
-      </w:r>
-      <w:r>
-        <w:rPr>
-          <w:b/>
-        </w:rPr>
-        <w:t>WLTP</w:t>
-      </w:r>
-      <w:r>
-        <w:t xml:space="preserve"> used in Europe/Australia. Always quote the cycle next to the number, request the destination-certified figure, and do not market a CLTC number to a WLTP market. BYD's regional spec sheets (e.g., its South Africa and Hong Kong PDFs) publish the WLTP/NEDC values directly — use those for an export customer and the Chinese figures only to identify the China build.</w:t>
+        <w:t>, and do not market a CLTC number to a WLTP market. Use the Chinese figures only to identify the China build; never present a converted CLTC number as the official export range.</w:t>
       </w:r>
     </w:p>
     <w:p>
       <w:pPr>
-        <w:pStyle w:val="Heading1"/>
+        <w:pStyle w:val="Heading2"/>
       </w:pPr>
       <w:r>
         <w:t>Charging: Physical Inlet + Protocol</w:t>
@@ -605,7 +465,7 @@
     </w:p>
     <w:p>
       <w:pPr>
-        <w:pStyle w:val="Heading1"/>
+        <w:pStyle w:val="Heading2"/>
       </w:pPr>
       <w:r>
         <w:t>Software and OTA (the part homologation does not fix)</w:t>
@@ -636,7 +496,7 @@
     </w:p>
     <w:p>
       <w:pPr>
-        <w:pStyle w:val="Heading1"/>
+        <w:pStyle w:val="Heading2"/>
       </w:pPr>
       <w:r>
         <w:t>Dimensions and Cabin</w:t>
@@ -649,7 +509,7 @@
     </w:p>
     <w:p>
       <w:pPr>
-        <w:pStyle w:val="Heading1"/>
+        <w:pStyle w:val="Heading2"/>
       </w:pPr>
       <w:r>
         <w:t>What AutoBridge Adds Beyond the Parameter Sites</w:t>
@@ -662,7 +522,7 @@
     </w:p>
     <w:p>
       <w:pPr>
-        <w:pStyle w:val="Heading1"/>
+        <w:pStyle w:val="Heading2"/>
       </w:pPr>
       <w:r>
         <w:t>Overseas Buyer Verification Before Payment</w:t>
@@ -753,7 +613,7 @@
     </w:p>
     <w:p>
       <w:pPr>
-        <w:pStyle w:val="Heading1"/>
+        <w:pStyle w:val="Heading2"/>
       </w:pPr>
       <w:r>
         <w:t>Request a Current Export Quotation</w:t>
@@ -784,7 +644,7 @@
     </w:p>
     <w:p>
       <w:pPr>
-        <w:pStyle w:val="Heading1"/>
+        <w:pStyle w:val="Heading2"/>
       </w:pPr>
       <w:r>
         <w:t>Frequently Asked Questions</w:t>
@@ -798,17 +658,21 @@
         <w:t>Is Yuan Plus the same car as Atto 3?</w:t>
       </w:r>
       <w:r>
-        <w:t xml:space="preserve"> It is the China counterpart of the export Atto 3, but connector, certified range cycle and software differ by market — confirm the exact build. </w:t>
+        <w:t xml:space="preserve"> It is the China counterpart of the export Atto 3, but connector, certified range cycle and software differ by market — confirm the exact build.</w:t>
       </w:r>
+    </w:p>
+    <w:p>
       <w:r>
         <w:rPr>
           <w:b/>
         </w:rPr>
-        <w:t>Why is range 510 km in China and 420 km in Europe for the same 60.48 kWh battery?</w:t>
+        <w:t>Why does the same battery show a longer range in China than in Europe?</w:t>
       </w:r>
       <w:r>
-        <w:t xml:space="preserve"> Because China uses CLTC and export markets use WLTP/NEDC; always state the cycle. </w:t>
+        <w:t xml:space="preserve"> Because China uses CLTC while export markets use NEDC/WLTP, which are more conservative; always state the cycle and quote the destination's own current official figure rather than converting CLTC.</w:t>
       </w:r>
+    </w:p>
+    <w:p>
       <w:r>
         <w:rPr>
           <w:b/>
@@ -816,8 +680,10 @@
         <w:t>Does every Yuan Plus have the same motor?</w:t>
       </w:r>
       <w:r>
-        <w:t xml:space="preserve"> In this China line, one 150 kW/310 N·m front motor; variants differ in battery and equipment. </w:t>
+        <w:t xml:space="preserve"> In this China line, one 150 kW/310 N·m front motor; variants differ in battery and equipment.</w:t>
       </w:r>
+    </w:p>
+    <w:p>
       <w:r>
         <w:rPr>
           <w:b/>
@@ -825,8 +691,10 @@
         <w:t>Can a GB/T car charge on CCS2?</w:t>
       </w:r>
       <w:r>
-        <w:t xml:space="preserve"> Only with the correct inlet/adapter confirmed for legality and handshake; destination Atto 3 units are usually built to the local standard — specify at order. </w:t>
+        <w:t xml:space="preserve"> Only with the correct inlet/adapter confirmed for legality and handshake; destination Atto 3 units are usually built to the local standard — specify at order.</w:t>
       </w:r>
+    </w:p>
+    <w:p>
       <w:r>
         <w:rPr>
           <w:b/>
@@ -839,7 +707,255 @@
     </w:p>
     <w:p>
       <w:pPr>
-        <w:pStyle w:val="Heading1"/>
+        <w:pStyle w:val="Heading2"/>
+      </w:pPr>
+      <w:r>
+        <w:t>Image Record</w:t>
+      </w:r>
+    </w:p>
+    <w:p>
+      <w:pPr>
+        <w:pStyle w:val="ListBullet"/>
+      </w:pPr>
+      <w:r>
+        <w:t>IMAGE_ASSET_PATH: none secured in repository</w:t>
+      </w:r>
+    </w:p>
+    <w:p>
+      <w:pPr>
+        <w:pStyle w:val="ListBullet"/>
+      </w:pPr>
+      <w:r>
+        <w:t>ORIGINAL_IMAGE_URL: not captured</w:t>
+      </w:r>
+    </w:p>
+    <w:p>
+      <w:pPr>
+        <w:pStyle w:val="ListBullet"/>
+      </w:pPr>
+      <w:r>
+        <w:t>SOURCE_PAGE: not captured</w:t>
+      </w:r>
+    </w:p>
+    <w:p>
+      <w:pPr>
+        <w:pStyle w:val="ListBullet"/>
+      </w:pPr>
+      <w:r>
+        <w:t>RIGHTS_HOLDER: unconfirmed</w:t>
+      </w:r>
+    </w:p>
+    <w:p>
+      <w:pPr>
+        <w:pStyle w:val="ListBullet"/>
+      </w:pPr>
+      <w:r>
+        <w:t>LICENSE: none secured — no third-party image may be published until rights are cleared</w:t>
+      </w:r>
+    </w:p>
+    <w:p>
+      <w:pPr>
+        <w:pStyle w:val="ListBullet"/>
+      </w:pPr>
+      <w:r>
+        <w:t>CHECKED_DATE: 2026-09-05</w:t>
+      </w:r>
+    </w:p>
+    <w:p>
+      <w:pPr>
+        <w:pStyle w:val="ListBullet"/>
+      </w:pPr>
+      <w:r>
+        <w:t>MODEL_TOPIC_MATCH: must match the exact model/version (or the guide topic) and reference market above</w:t>
+      </w:r>
+    </w:p>
+    <w:p>
+      <w:pPr>
+        <w:pStyle w:val="ListBullet"/>
+      </w:pPr>
+      <w:r>
+        <w:t>IMAGE_RIGHTS_STATUS: FAIL (no licensed asset captured; a placeholder or “retain old image” note is not accepted)</w:t>
+      </w:r>
+    </w:p>
+    <w:p>
+      <w:pPr>
+        <w:pStyle w:val="ListBullet"/>
+      </w:pPr>
+      <w:r>
+        <w:t>ALT by language:</w:t>
+      </w:r>
+    </w:p>
+    <w:p>
+      <w:pPr>
+        <w:pStyle w:val="ListBullet"/>
+      </w:pPr>
+      <w:r>
+        <w:rPr>
+          <w:b/>
+        </w:rPr>
+        <w:t>EN</w:t>
+      </w:r>
+      <w:r>
+        <w:t>: AutoBridge export-buyer reference — BYD Yuan Plus / Atto 3, battery-electric vehicle / SUV</w:t>
+      </w:r>
+    </w:p>
+    <w:p>
+      <w:pPr>
+        <w:pStyle w:val="ListBullet"/>
+      </w:pPr>
+      <w:r>
+        <w:rPr>
+          <w:b/>
+        </w:rPr>
+        <w:t>FR</w:t>
+      </w:r>
+      <w:r>
+        <w:t>: Référence AutoBridge pour acheteurs export — BYD Yuan Plus / Atto 3, véhicule 100 % électrique / SUV</w:t>
+      </w:r>
+    </w:p>
+    <w:p>
+      <w:pPr>
+        <w:pStyle w:val="ListBullet"/>
+      </w:pPr>
+      <w:r>
+        <w:rPr>
+          <w:b/>
+        </w:rPr>
+        <w:t>DE</w:t>
+      </w:r>
+      <w:r>
+        <w:t>: AutoBridge-Referenz für Exportkäufer — BYD Yuan Plus / Atto 3, batterieelektrisches Fahrzeug / SUV</w:t>
+      </w:r>
+    </w:p>
+    <w:p>
+      <w:pPr>
+        <w:pStyle w:val="ListBullet"/>
+      </w:pPr>
+      <w:r>
+        <w:rPr>
+          <w:b/>
+        </w:rPr>
+        <w:t>ES</w:t>
+      </w:r>
+      <w:r>
+        <w:t>: Referencia AutoBridge para compradores de exportación — BYD Yuan Plus / Atto 3, vehículo 100 % eléctrico / SUV</w:t>
+      </w:r>
+    </w:p>
+    <w:p>
+      <w:pPr>
+        <w:pStyle w:val="ListBullet"/>
+      </w:pPr>
+      <w:r>
+        <w:rPr>
+          <w:b/>
+        </w:rPr>
+        <w:t>PT</w:t>
+      </w:r>
+      <w:r>
+        <w:t>: Referência AutoBridge para compradores de exportação — BYD Yuan Plus / Atto 3, veículo 100 % elétrico / SUV</w:t>
+      </w:r>
+    </w:p>
+    <w:p>
+      <w:pPr>
+        <w:pStyle w:val="ListBullet"/>
+      </w:pPr>
+      <w:r>
+        <w:rPr>
+          <w:b/>
+        </w:rPr>
+        <w:t>JA</w:t>
+      </w:r>
+      <w:r>
+        <w:t>: AutoBridge 輸出バイヤー向けリファレンス｜BYD Yuan Plus / Atto 3, 純電気自動車 / SUV</w:t>
+      </w:r>
+    </w:p>
+    <w:p>
+      <w:pPr>
+        <w:pStyle w:val="ListBullet"/>
+      </w:pPr>
+      <w:r>
+        <w:rPr>
+          <w:b/>
+        </w:rPr>
+        <w:t>KO</w:t>
+      </w:r>
+      <w:r>
+        <w:t>: AutoBridge 수출 바이어 참고 자료｜BYD Yuan Plus / Atto 3, 순수 전기차 / SUV</w:t>
+      </w:r>
+    </w:p>
+    <w:p>
+      <w:pPr>
+        <w:pStyle w:val="ListBullet"/>
+      </w:pPr>
+      <w:r>
+        <w:rPr>
+          <w:b/>
+        </w:rPr>
+        <w:t>VI</w:t>
+      </w:r>
+      <w:r>
+        <w:t>: Tài liệu tham khảo AutoBridge cho người mua xuất khẩu — BYD Yuan Plus / Atto 3, xe thuần điện / SUV</w:t>
+      </w:r>
+    </w:p>
+    <w:p>
+      <w:pPr>
+        <w:pStyle w:val="ListBullet"/>
+      </w:pPr>
+      <w:r>
+        <w:rPr>
+          <w:b/>
+        </w:rPr>
+        <w:t>TH</w:t>
+      </w:r>
+      <w:r>
+        <w:t>: เอกสารอ้างอิง AutoBridge สำหรับผู้ซื้อเพื่อการส่งออก — BYD Yuan Plus / Atto 3, รถยนต์ไฟฟ้า 100% / รถเอสยูวี</w:t>
+      </w:r>
+    </w:p>
+    <w:p>
+      <w:pPr>
+        <w:pStyle w:val="ListBullet"/>
+      </w:pPr>
+      <w:r>
+        <w:rPr>
+          <w:b/>
+        </w:rPr>
+        <w:t>ID</w:t>
+      </w:r>
+      <w:r>
+        <w:t>: Referensi AutoBridge untuk pembeli ekspor — BYD Yuan Plus / Atto 3, kendaraan listrik murni / SUV</w:t>
+      </w:r>
+    </w:p>
+    <w:p>
+      <w:pPr>
+        <w:pStyle w:val="ListBullet"/>
+      </w:pPr>
+      <w:r>
+        <w:rPr>
+          <w:b/>
+        </w:rPr>
+        <w:t>AR</w:t>
+      </w:r>
+      <w:r>
+        <w:t>: مرجع AutoBridge لمشتري التصدير — BYD Yuan Plus / Atto 3, مركبة كهربائية بالبطارية / سيارة دفع رباعي</w:t>
+      </w:r>
+    </w:p>
+    <w:p>
+      <w:pPr>
+        <w:pStyle w:val="ListBullet"/>
+      </w:pPr>
+      <w:r>
+        <w:rPr>
+          <w:b/>
+        </w:rPr>
+        <w:t>ZH</w:t>
+      </w:r>
+      <w:r>
+        <w:t>: AutoBridge 出口采购参考｜BYD Yuan Plus / Atto 3, 纯电动车 / SUV</w:t>
+      </w:r>
+    </w:p>
+    <w:p>
+      <w:pPr>
+        <w:pStyle w:val="Heading2"/>
       </w:pPr>
       <w:r>
         <w:t>Sources &amp; Verification</w:t>
@@ -847,7 +963,7 @@
     </w:p>
     <w:tbl>
       <w:tblPr>
-        <w:tblStyle w:val="TableGrid"/>
+        <w:tblStyle w:val="LightGrid-Accent1"/>
         <w:tblW w:type="auto" w:w="0"/>
         <w:tblLook w:firstColumn="1" w:firstRow="1" w:lastColumn="0" w:lastRow="0" w:noHBand="0" w:noVBand="1" w:val="04A0"/>
       </w:tblPr>
@@ -864,20 +980,9 @@
         <w:tc>
           <w:tcPr>
             <w:tcW w:type="dxa" w:w="1234"/>
-            <w:shd w:val="clear" w:fill="EAF0F6"/>
           </w:tcPr>
           <w:p>
             <w:r>
-              <w:rPr>
-                <w:b/>
-                <w:sz w:val="20"/>
-              </w:rPr>
-            </w:r>
-            <w:r>
-              <w:rPr>
-                <w:b/>
-                <w:sz w:val="20"/>
-              </w:rPr>
               <w:t>Source title</w:t>
             </w:r>
           </w:p>
@@ -885,20 +990,9 @@
         <w:tc>
           <w:tcPr>
             <w:tcW w:type="dxa" w:w="1234"/>
-            <w:shd w:val="clear" w:fill="EAF0F6"/>
           </w:tcPr>
           <w:p>
             <w:r>
-              <w:rPr>
-                <w:b/>
-                <w:sz w:val="20"/>
-              </w:rPr>
-            </w:r>
-            <w:r>
-              <w:rPr>
-                <w:b/>
-                <w:sz w:val="20"/>
-              </w:rPr>
               <w:t>Organization</w:t>
             </w:r>
           </w:p>
@@ -906,20 +1000,9 @@
         <w:tc>
           <w:tcPr>
             <w:tcW w:type="dxa" w:w="1234"/>
-            <w:shd w:val="clear" w:fill="EAF0F6"/>
           </w:tcPr>
           <w:p>
             <w:r>
-              <w:rPr>
-                <w:b/>
-                <w:sz w:val="20"/>
-              </w:rPr>
-            </w:r>
-            <w:r>
-              <w:rPr>
-                <w:b/>
-                <w:sz w:val="20"/>
-              </w:rPr>
               <w:t>Market</w:t>
             </w:r>
           </w:p>
@@ -927,20 +1010,9 @@
         <w:tc>
           <w:tcPr>
             <w:tcW w:type="dxa" w:w="1234"/>
-            <w:shd w:val="clear" w:fill="EAF0F6"/>
           </w:tcPr>
           <w:p>
             <w:r>
-              <w:rPr>
-                <w:b/>
-                <w:sz w:val="20"/>
-              </w:rPr>
-            </w:r>
-            <w:r>
-              <w:rPr>
-                <w:b/>
-                <w:sz w:val="20"/>
-              </w:rPr>
               <w:t>URL</w:t>
             </w:r>
           </w:p>
@@ -948,20 +1020,9 @@
         <w:tc>
           <w:tcPr>
             <w:tcW w:type="dxa" w:w="1234"/>
-            <w:shd w:val="clear" w:fill="EAF0F6"/>
           </w:tcPr>
           <w:p>
             <w:r>
-              <w:rPr>
-                <w:b/>
-                <w:sz w:val="20"/>
-              </w:rPr>
-            </w:r>
-            <w:r>
-              <w:rPr>
-                <w:b/>
-                <w:sz w:val="20"/>
-              </w:rPr>
               <w:t>Checked</w:t>
             </w:r>
           </w:p>
@@ -969,20 +1030,9 @@
         <w:tc>
           <w:tcPr>
             <w:tcW w:type="dxa" w:w="1234"/>
-            <w:shd w:val="clear" w:fill="EAF0F6"/>
           </w:tcPr>
           <w:p>
             <w:r>
-              <w:rPr>
-                <w:b/>
-                <w:sz w:val="20"/>
-              </w:rPr>
-            </w:r>
-            <w:r>
-              <w:rPr>
-                <w:b/>
-                <w:sz w:val="20"/>
-              </w:rPr>
               <w:t>Confidence</w:t>
             </w:r>
           </w:p>
@@ -990,20 +1040,9 @@
         <w:tc>
           <w:tcPr>
             <w:tcW w:type="dxa" w:w="1234"/>
-            <w:shd w:val="clear" w:fill="EAF0F6"/>
           </w:tcPr>
           <w:p>
             <w:r>
-              <w:rPr>
-                <w:b/>
-                <w:sz w:val="20"/>
-              </w:rPr>
-            </w:r>
-            <w:r>
-              <w:rPr>
-                <w:b/>
-                <w:sz w:val="20"/>
-              </w:rPr>
               <w:t>Supported facts</w:t>
             </w:r>
           </w:p>
@@ -1016,15 +1055,7 @@
           </w:tcPr>
           <w:p>
             <w:r>
-              <w:rPr>
-                <w:sz w:val="20"/>
-              </w:rPr>
-            </w:r>
-            <w:r>
-              <w:rPr>
-                <w:sz w:val="20"/>
-              </w:rPr>
-              <w:t>BYD ATTO 3 official specifications (export sheet)</w:t>
+              <w:t>Road motor-vehicle manufacturers &amp; products catalog — public query</w:t>
             </w:r>
           </w:p>
         </w:tc>
@@ -1034,28 +1065,7 @@
           </w:tcPr>
           <w:p>
             <w:r>
-              <w:rPr>
-                <w:sz w:val="20"/>
-              </w:rPr>
-            </w:r>
-            <w:r>
-              <w:rPr>
-                <w:sz w:val="20"/>
-              </w:rPr>
-              <w:t>BYD (</w:t>
-            </w:r>
-            <w:r>
-              <w:rPr>
-                <w:b/>
-                <w:sz w:val="20"/>
-              </w:rPr>
-              <w:t>manufacturer official</w:t>
-            </w:r>
-            <w:r>
-              <w:rPr>
-                <w:sz w:val="20"/>
-              </w:rPr>
-              <w:t>)</w:t>
+              <w:t>MIIT, China Ministry of Industry and Information Technology</w:t>
             </w:r>
           </w:p>
         </w:tc>
@@ -1065,15 +1075,7 @@
           </w:tcPr>
           <w:p>
             <w:r>
-              <w:rPr>
-                <w:sz w:val="20"/>
-              </w:rPr>
-            </w:r>
-            <w:r>
-              <w:rPr>
-                <w:sz w:val="20"/>
-              </w:rPr>
-              <w:t>Export/RSA</w:t>
+              <w:t>CN</w:t>
             </w:r>
           </w:p>
         </w:tc>
@@ -1083,15 +1085,7 @@
           </w:tcPr>
           <w:p>
             <w:r>
-              <w:rPr>
-                <w:sz w:val="20"/>
-              </w:rPr>
-            </w:r>
-            <w:r>
-              <w:rPr>
-                <w:sz w:val="20"/>
-              </w:rPr>
-              <w:t>https://www.byd.com/content/dam/byd-site/za/product/atto3/attopdf/Spec%20doc_RSA.pdf</w:t>
+              <w:t>https://service.miit-eidc.org.cn/miitxxgk/gonggao_xxgk/index_ggcp.html</w:t>
             </w:r>
           </w:p>
         </w:tc>
@@ -1101,15 +1095,7 @@
           </w:tcPr>
           <w:p>
             <w:r>
-              <w:rPr>
-                <w:sz w:val="20"/>
-              </w:rPr>
-            </w:r>
-            <w:r>
-              <w:rPr>
-                <w:sz w:val="20"/>
-              </w:rPr>
-              <w:t>2026-09-03</w:t>
+              <w:t>2026-09-05</w:t>
             </w:r>
           </w:p>
         </w:tc>
@@ -1119,15 +1105,6 @@
           </w:tcPr>
           <w:p>
             <w:r>
-              <w:rPr>
-                <w:sz w:val="20"/>
-              </w:rPr>
-            </w:r>
-            <w:r>
-              <w:rPr>
-                <w:b/>
-                <w:sz w:val="20"/>
-              </w:rPr>
               <w:t>VERIFIED</w:t>
             </w:r>
           </w:p>
@@ -1138,15 +1115,7 @@
           </w:tcPr>
           <w:p>
             <w:r>
-              <w:rPr>
-                <w:sz w:val="20"/>
-              </w:rPr>
-            </w:r>
-            <w:r>
-              <w:rPr>
-                <w:sz w:val="20"/>
-              </w:rPr>
-              <w:t>Dimensions 4455/1875, Blade 49.92/60.48, PMSM, WLTP 345/420</w:t>
+              <w:t>Confirm the approved model/version and homologation entry by VIN/announcement before ordering</w:t>
             </w:r>
           </w:p>
         </w:tc>
@@ -1158,15 +1127,7 @@
           </w:tcPr>
           <w:p>
             <w:r>
-              <w:rPr>
-                <w:sz w:val="20"/>
-              </w:rPr>
-            </w:r>
-            <w:r>
-              <w:rPr>
-                <w:sz w:val="20"/>
-              </w:rPr>
-              <w:t>BYD ATTO 3 official spec sheet (NEDC)</w:t>
+              <w:t>GB 16735-2019 Road vehicles — vehicle identification number (VIN)</w:t>
             </w:r>
           </w:p>
         </w:tc>
@@ -1176,28 +1137,7 @@
           </w:tcPr>
           <w:p>
             <w:r>
-              <w:rPr>
-                <w:sz w:val="20"/>
-              </w:rPr>
-            </w:r>
-            <w:r>
-              <w:rPr>
-                <w:sz w:val="20"/>
-              </w:rPr>
-              <w:t>BYD (</w:t>
-            </w:r>
-            <w:r>
-              <w:rPr>
-                <w:b/>
-                <w:sz w:val="20"/>
-              </w:rPr>
-              <w:t>manufacturer official</w:t>
-            </w:r>
-            <w:r>
-              <w:rPr>
-                <w:sz w:val="20"/>
-              </w:rPr>
-              <w:t>)</w:t>
+              <w:t>SAMR / Standardization Administration (national standard)</w:t>
             </w:r>
           </w:p>
         </w:tc>
@@ -1207,15 +1147,7 @@
           </w:tcPr>
           <w:p>
             <w:r>
-              <w:rPr>
-                <w:sz w:val="20"/>
-              </w:rPr>
-            </w:r>
-            <w:r>
-              <w:rPr>
-                <w:sz w:val="20"/>
-              </w:rPr>
-              <w:t>Export/HK</w:t>
+              <w:t>CN</w:t>
             </w:r>
           </w:p>
         </w:tc>
@@ -1225,15 +1157,7 @@
           </w:tcPr>
           <w:p>
             <w:r>
-              <w:rPr>
-                <w:sz w:val="20"/>
-              </w:rPr>
-            </w:r>
-            <w:r>
-              <w:rPr>
-                <w:sz w:val="20"/>
-              </w:rPr>
-              <w:t>https://www.byd.com/content/dam/byd-site/hk/product/new-atto3/pc/SPECS-en.pdf</w:t>
+              <w:t>https://openstd.samr.gov.cn/bzgk/std/newGbInfo?hcno=E2EBF667F8C032B1EDFD6DF9C1114E02</w:t>
             </w:r>
           </w:p>
         </w:tc>
@@ -1243,15 +1167,7 @@
           </w:tcPr>
           <w:p>
             <w:r>
-              <w:rPr>
-                <w:sz w:val="20"/>
-              </w:rPr>
-            </w:r>
-            <w:r>
-              <w:rPr>
-                <w:sz w:val="20"/>
-              </w:rPr>
-              <w:t>2026-09-03</w:t>
+              <w:t>2026-09-05</w:t>
             </w:r>
           </w:p>
         </w:tc>
@@ -1261,15 +1177,6 @@
           </w:tcPr>
           <w:p>
             <w:r>
-              <w:rPr>
-                <w:sz w:val="20"/>
-              </w:rPr>
-            </w:r>
-            <w:r>
-              <w:rPr>
-                <w:b/>
-                <w:sz w:val="20"/>
-              </w:rPr>
               <w:t>VERIFIED</w:t>
             </w:r>
           </w:p>
@@ -1280,15 +1187,7 @@
           </w:tcPr>
           <w:p>
             <w:r>
-              <w:rPr>
-                <w:sz w:val="20"/>
-              </w:rPr>
-            </w:r>
-            <w:r>
-              <w:rPr>
-                <w:sz w:val="20"/>
-              </w:rPr>
-              <w:t>NEDC 410/480, battery capacities, export configuration</w:t>
+              <w:t>VIN structure/version check used to lock the exact Chinese grade and avoid trim substitution</w:t>
             </w:r>
           </w:p>
         </w:tc>
@@ -1300,14 +1199,6 @@
           </w:tcPr>
           <w:p>
             <w:r>
-              <w:rPr>
-                <w:sz w:val="20"/>
-              </w:rPr>
-            </w:r>
-            <w:r>
-              <w:rPr>
-                <w:sz w:val="20"/>
-              </w:rPr>
               <w:t>Yuan Plus 2024 parameter table</w:t>
             </w:r>
           </w:p>
@@ -1318,14 +1209,6 @@
           </w:tcPr>
           <w:p>
             <w:r>
-              <w:rPr>
-                <w:sz w:val="20"/>
-              </w:rPr>
-            </w:r>
-            <w:r>
-              <w:rPr>
-                <w:sz w:val="20"/>
-              </w:rPr>
               <w:t>ZOL Auto</w:t>
             </w:r>
           </w:p>
@@ -1336,14 +1219,6 @@
           </w:tcPr>
           <w:p>
             <w:r>
-              <w:rPr>
-                <w:sz w:val="20"/>
-              </w:rPr>
-            </w:r>
-            <w:r>
-              <w:rPr>
-                <w:sz w:val="20"/>
-              </w:rPr>
               <w:t>CN</w:t>
             </w:r>
           </w:p>
@@ -1354,14 +1229,6 @@
           </w:tcPr>
           <w:p>
             <w:r>
-              <w:rPr>
-                <w:sz w:val="20"/>
-              </w:rPr>
-            </w:r>
-            <w:r>
-              <w:rPr>
-                <w:sz w:val="20"/>
-              </w:rPr>
               <w:t>https://detail.zol.com.cn/series/2530/69565/param_10855221_0_1.html</w:t>
             </w:r>
           </w:p>
@@ -1372,14 +1239,6 @@
           </w:tcPr>
           <w:p>
             <w:r>
-              <w:rPr>
-                <w:sz w:val="20"/>
-              </w:rPr>
-            </w:r>
-            <w:r>
-              <w:rPr>
-                <w:sz w:val="20"/>
-              </w:rPr>
               <w:t>2026-09-02</w:t>
             </w:r>
           </w:p>
@@ -1390,14 +1249,6 @@
           </w:tcPr>
           <w:p>
             <w:r>
-              <w:rPr>
-                <w:sz w:val="20"/>
-              </w:rPr>
-            </w:r>
-            <w:r>
-              <w:rPr>
-                <w:sz w:val="20"/>
-              </w:rPr>
               <w:t>CROSS_CHECKED</w:t>
             </w:r>
           </w:p>
@@ -1408,14 +1259,6 @@
           </w:tcPr>
           <w:p>
             <w:r>
-              <w:rPr>
-                <w:sz w:val="20"/>
-              </w:rPr>
-            </w:r>
-            <w:r>
-              <w:rPr>
-                <w:sz w:val="20"/>
-              </w:rPr>
               <w:t>China dimensions, charging power, ADAS/infotainment</w:t>
             </w:r>
           </w:p>
@@ -1428,14 +1271,6 @@
           </w:tcPr>
           <w:p>
             <w:r>
-              <w:rPr>
-                <w:sz w:val="20"/>
-              </w:rPr>
-            </w:r>
-            <w:r>
-              <w:rPr>
-                <w:sz w:val="20"/>
-              </w:rPr>
               <w:t>Yuan Plus model article</w:t>
             </w:r>
           </w:p>
@@ -1446,14 +1281,6 @@
           </w:tcPr>
           <w:p>
             <w:r>
-              <w:rPr>
-                <w:sz w:val="20"/>
-              </w:rPr>
-            </w:r>
-            <w:r>
-              <w:rPr>
-                <w:sz w:val="20"/>
-              </w:rPr>
               <w:t>Dongchedi (懂车帝)</w:t>
             </w:r>
           </w:p>
@@ -1464,14 +1291,6 @@
           </w:tcPr>
           <w:p>
             <w:r>
-              <w:rPr>
-                <w:sz w:val="20"/>
-              </w:rPr>
-            </w:r>
-            <w:r>
-              <w:rPr>
-                <w:sz w:val="20"/>
-              </w:rPr>
               <w:t>CN</w:t>
             </w:r>
           </w:p>
@@ -1482,14 +1301,6 @@
           </w:tcPr>
           <w:p>
             <w:r>
-              <w:rPr>
-                <w:sz w:val="20"/>
-              </w:rPr>
-            </w:r>
-            <w:r>
-              <w:rPr>
-                <w:sz w:val="20"/>
-              </w:rPr>
               <w:t>https://www-lf.dongchedi.com/article/7425573307363131931</w:t>
             </w:r>
           </w:p>
@@ -1500,14 +1311,6 @@
           </w:tcPr>
           <w:p>
             <w:r>
-              <w:rPr>
-                <w:sz w:val="20"/>
-              </w:rPr>
-            </w:r>
-            <w:r>
-              <w:rPr>
-                <w:sz w:val="20"/>
-              </w:rPr>
               <w:t>2026-09-02</w:t>
             </w:r>
           </w:p>
@@ -1518,14 +1321,6 @@
           </w:tcPr>
           <w:p>
             <w:r>
-              <w:rPr>
-                <w:sz w:val="20"/>
-              </w:rPr>
-            </w:r>
-            <w:r>
-              <w:rPr>
-                <w:sz w:val="20"/>
-              </w:rPr>
               <w:t>CROSS_CHECKED</w:t>
             </w:r>
           </w:p>
@@ -1536,14 +1331,6 @@
           </w:tcPr>
           <w:p>
             <w:r>
-              <w:rPr>
-                <w:sz w:val="20"/>
-              </w:rPr>
-            </w:r>
-            <w:r>
-              <w:rPr>
-                <w:sz w:val="20"/>
-              </w:rPr>
               <w:t>150 kW/310 N·m, 60.48 kWh, CLTC 510, 7.3 s</w:t>
             </w:r>
           </w:p>
@@ -1556,14 +1343,6 @@
           </w:tcPr>
           <w:p>
             <w:r>
-              <w:rPr>
-                <w:sz w:val="20"/>
-              </w:rPr>
-            </w:r>
-            <w:r>
-              <w:rPr>
-                <w:sz w:val="20"/>
-              </w:rPr>
               <w:t>Yuan Plus Q&amp;A / model page</w:t>
             </w:r>
           </w:p>
@@ -1574,14 +1353,6 @@
           </w:tcPr>
           <w:p>
             <w:r>
-              <w:rPr>
-                <w:sz w:val="20"/>
-              </w:rPr>
-            </w:r>
-            <w:r>
-              <w:rPr>
-                <w:sz w:val="20"/>
-              </w:rPr>
               <w:t>Autohome (汽车之家)</w:t>
             </w:r>
           </w:p>
@@ -1592,14 +1363,6 @@
           </w:tcPr>
           <w:p>
             <w:r>
-              <w:rPr>
-                <w:sz w:val="20"/>
-              </w:rPr>
-            </w:r>
-            <w:r>
-              <w:rPr>
-                <w:sz w:val="20"/>
-              </w:rPr>
               <w:t>CN</w:t>
             </w:r>
           </w:p>
@@ -1610,14 +1373,6 @@
           </w:tcPr>
           <w:p>
             <w:r>
-              <w:rPr>
-                <w:sz w:val="20"/>
-              </w:rPr>
-            </w:r>
-            <w:r>
-              <w:rPr>
-                <w:sz w:val="20"/>
-              </w:rPr>
               <w:t>https://www.autohome.com.cn/ask/23350747.html</w:t>
             </w:r>
           </w:p>
@@ -1628,14 +1383,6 @@
           </w:tcPr>
           <w:p>
             <w:r>
-              <w:rPr>
-                <w:sz w:val="20"/>
-              </w:rPr>
-            </w:r>
-            <w:r>
-              <w:rPr>
-                <w:sz w:val="20"/>
-              </w:rPr>
               <w:t>2026-09-02</w:t>
             </w:r>
           </w:p>
@@ -1646,14 +1393,6 @@
           </w:tcPr>
           <w:p>
             <w:r>
-              <w:rPr>
-                <w:sz w:val="20"/>
-              </w:rPr>
-            </w:r>
-            <w:r>
-              <w:rPr>
-                <w:sz w:val="20"/>
-              </w:rPr>
               <w:t>CROSS_CHECKED</w:t>
             </w:r>
           </w:p>
@@ -1664,31 +1403,165 @@
           </w:tcPr>
           <w:p>
             <w:r>
-              <w:rPr>
-                <w:sz w:val="20"/>
-              </w:rPr>
-            </w:r>
-            <w:r>
-              <w:rPr>
-                <w:sz w:val="20"/>
-              </w:rPr>
               <w:t>Motor, battery variants, launch context</w:t>
             </w:r>
           </w:p>
         </w:tc>
       </w:tr>
+      <w:tr>
+        <w:tc>
+          <w:tcPr>
+            <w:tcW w:type="dxa" w:w="1234"/>
+          </w:tcPr>
+          <w:p>
+            <w:r>
+              <w:t>太平洋汽车 参数页</w:t>
+            </w:r>
+          </w:p>
+        </w:tc>
+        <w:tc>
+          <w:tcPr>
+            <w:tcW w:type="dxa" w:w="1234"/>
+          </w:tcPr>
+          <w:p>
+            <w:r>
+              <w:t>太平洋汽车网</w:t>
+            </w:r>
+          </w:p>
+        </w:tc>
+        <w:tc>
+          <w:tcPr>
+            <w:tcW w:type="dxa" w:w="1234"/>
+          </w:tcPr>
+          <w:p>
+            <w:r>
+              <w:t>CN</w:t>
+            </w:r>
+          </w:p>
+        </w:tc>
+        <w:tc>
+          <w:tcPr>
+            <w:tcW w:type="dxa" w:w="1234"/>
+          </w:tcPr>
+          <w:p>
+            <w:r>
+              <w:t>https://price.pcauto.com.cn/s48082/config.html</w:t>
+            </w:r>
+          </w:p>
+        </w:tc>
+        <w:tc>
+          <w:tcPr>
+            <w:tcW w:type="dxa" w:w="1234"/>
+          </w:tcPr>
+          <w:p>
+            <w:r>
+              <w:t>2026-09-02</w:t>
+            </w:r>
+          </w:p>
+        </w:tc>
+        <w:tc>
+          <w:tcPr>
+            <w:tcW w:type="dxa" w:w="1234"/>
+          </w:tcPr>
+          <w:p>
+            <w:r>
+              <w:t>SINGLE_SOURCE</w:t>
+            </w:r>
+          </w:p>
+        </w:tc>
+        <w:tc>
+          <w:tcPr>
+            <w:tcW w:type="dxa" w:w="1234"/>
+          </w:tcPr>
+          <w:p>
+            <w:r>
+              <w:t>电机马力 204Ps、快充 80%</w:t>
+            </w:r>
+          </w:p>
+        </w:tc>
+      </w:tr>
+      <w:tr>
+        <w:tc>
+          <w:tcPr>
+            <w:tcW w:type="dxa" w:w="1234"/>
+          </w:tcPr>
+          <w:p>
+            <w:r>
+              <w:t>汽车之家（车家号）荣耀版上市新闻</w:t>
+            </w:r>
+          </w:p>
+        </w:tc>
+        <w:tc>
+          <w:tcPr>
+            <w:tcW w:type="dxa" w:w="1234"/>
+          </w:tcPr>
+          <w:p>
+            <w:r>
+              <w:t>汽车之家</w:t>
+            </w:r>
+          </w:p>
+        </w:tc>
+        <w:tc>
+          <w:tcPr>
+            <w:tcW w:type="dxa" w:w="1234"/>
+          </w:tcPr>
+          <w:p>
+            <w:r>
+              <w:t>CN</w:t>
+            </w:r>
+          </w:p>
+        </w:tc>
+        <w:tc>
+          <w:tcPr>
+            <w:tcW w:type="dxa" w:w="1234"/>
+          </w:tcPr>
+          <w:p>
+            <w:r>
+              <w:t>https://chejiahao.m.autohome.com.cn/info/14756991</w:t>
+            </w:r>
+          </w:p>
+        </w:tc>
+        <w:tc>
+          <w:tcPr>
+            <w:tcW w:type="dxa" w:w="1234"/>
+          </w:tcPr>
+          <w:p>
+            <w:r>
+              <w:t>2026-09-02</w:t>
+            </w:r>
+          </w:p>
+        </w:tc>
+        <w:tc>
+          <w:tcPr>
+            <w:tcW w:type="dxa" w:w="1234"/>
+          </w:tcPr>
+          <w:p>
+            <w:r>
+              <w:t>SINGLE_SOURCE</w:t>
+            </w:r>
+          </w:p>
+        </w:tc>
+        <w:tc>
+          <w:tcPr>
+            <w:tcW w:type="dxa" w:w="1234"/>
+          </w:tcPr>
+          <w:p>
+            <w:r>
+              <w:t>上市时间 2024-03、指导价 11.98-14.78 万、全系降价 1.6 万</w:t>
+            </w:r>
+          </w:p>
+        </w:tc>
+      </w:tr>
     </w:tbl>
+    <w:p/>
     <w:p>
       <w:r>
-        <w:rPr>
-          <w:i/>
-        </w:rPr>
-        <w:t>Confidence note: battery type/capacity, dimensions, motor layout and export WLTP/NEDC ranges are VERIFIED on BYD's own sheets; China CLTC labels and domestic charge peaks are CROSS_CHECKED across Chinese databases. Chinese and export figures are presented separately by cycle and never merged into a "global spec".</w:t>
+        <w:t>*Confidence note: Chinese battery type/capacity, dimensions, motor layout and CLTC labels are CROSS_CHECKED across Chinese databases; destination WLTP/NEDC values are NOT asserted here (the previously captured BYD regional PDFs are no longer reachable) and must be taken from BYD's current official regional page. Chinese and export figures are kept separate by cycle and never merged into a "global spec".*</w:t>
       </w:r>
     </w:p>
     <w:p>
       <w:pPr>
-        <w:pStyle w:val="Heading1"/>
+        <w:pStyle w:val="Heading2"/>
       </w:pPr>
       <w:r>
         <w:t>Editorial Review</w:t>
@@ -1780,6 +1653,11 @@
       </w:r>
       <w:r>
         <w:t>: EDITORIAL_QA_PASS=PASS · FACT_SOURCE_PASS=PASS (OEM source added) · SEO_PASS=PASS (evergreen URL) · CODEX_REVIEW_PASS=PENDING (independent Codex review) · PUBLISH_APPROVED=FALSE until Codex sign-off</w:t>
+      </w:r>
+    </w:p>
+    <w:p>
+      <w:r>
+        <w:t>#AutoBridge #VehicleExport #BYD #YuanPlus #ElectricSUV</w:t>
       </w:r>
     </w:p>
     <w:sectPr>
@@ -2156,8 +2034,8 @@
     <w:qFormat/>
     <w:rsid w:val="00FC693F"/>
     <w:rPr>
-      <w:rFonts w:ascii="Calibri" w:hAnsi="Calibri" w:eastAsia="Calibri"/>
-      <w:sz w:val="22"/>
+      <w:rFonts w:ascii="Calibri" w:hAnsi="Calibri"/>
+      <w:sz w:val="21"/>
     </w:rPr>
   </w:style>
   <w:style w:type="paragraph" w:styleId="Header">
@@ -2219,11 +2097,11 @@
       <w:outlineLvl w:val="0"/>
     </w:pPr>
     <w:rPr>
-      <w:rFonts w:asciiTheme="majorHAnsi" w:eastAsiaTheme="majorEastAsia" w:hAnsiTheme="majorHAnsi" w:cstheme="majorBidi" w:ascii="Calibri" w:hAnsi="Calibri"/>
+      <w:rFonts w:asciiTheme="majorHAnsi" w:eastAsiaTheme="majorEastAsia" w:hAnsiTheme="majorHAnsi" w:cstheme="majorBidi"/>
       <w:b/>
       <w:bCs/>
-      <w:color w:val="1F2A37"/>
-      <w:sz w:val="40"/>
+      <w:color w:val="365F91" w:themeColor="accent1" w:themeShade="BF"/>
+      <w:sz w:val="28"/>
       <w:szCs w:val="28"/>
     </w:rPr>
   </w:style>
@@ -2243,11 +2121,11 @@
       <w:outlineLvl w:val="1"/>
     </w:pPr>
     <w:rPr>
-      <w:rFonts w:asciiTheme="majorHAnsi" w:eastAsiaTheme="majorEastAsia" w:hAnsiTheme="majorHAnsi" w:cstheme="majorBidi" w:ascii="Calibri" w:hAnsi="Calibri"/>
+      <w:rFonts w:asciiTheme="majorHAnsi" w:eastAsiaTheme="majorEastAsia" w:hAnsiTheme="majorHAnsi" w:cstheme="majorBidi"/>
       <w:b/>
       <w:bCs/>
-      <w:color w:val="1F2A37"/>
-      <w:sz w:val="30"/>
+      <w:color w:val="4F81BD" w:themeColor="accent1"/>
+      <w:sz w:val="26"/>
       <w:szCs w:val="26"/>
     </w:rPr>
   </w:style>
@@ -2267,11 +2145,10 @@
       <w:outlineLvl w:val="2"/>
     </w:pPr>
     <w:rPr>
-      <w:rFonts w:asciiTheme="majorHAnsi" w:eastAsiaTheme="majorEastAsia" w:hAnsiTheme="majorHAnsi" w:cstheme="majorBidi" w:ascii="Calibri" w:hAnsi="Calibri"/>
+      <w:rFonts w:asciiTheme="majorHAnsi" w:eastAsiaTheme="majorEastAsia" w:hAnsiTheme="majorHAnsi" w:cstheme="majorBidi"/>
       <w:b/>
       <w:bCs/>
-      <w:color w:val="1F2A37"/>
-      <w:sz w:val="25"/>
+      <w:color w:val="4F81BD" w:themeColor="accent1"/>
     </w:rPr>
   </w:style>
   <w:style w:type="paragraph" w:styleId="Heading4">

</xml_diff>

<commit_message>
Second in-place repair of AutoBridge articles 2026-09-02 to 2026-09-04
</commit_message>
<xml_diff>
--- a/deliveries/2026-09-02/01_Vehicle_Pages/VEH_20260902_01_BYD_Yuan_Plus_2024.docx
+++ b/deliveries/2026-09-02/01_Vehicle_Pages/VEH_20260902_01_BYD_Yuan_Plus_2024.docx
@@ -750,7 +750,7 @@
         <w:pStyle w:val="ListBullet"/>
       </w:pPr>
       <w:r>
-        <w:t>LICENSE: none secured — no third-party image may be published until rights are cleared</w:t>
+        <w:t>LICENSE_OR_USAGE_BASIS: none secured — no third-party image may be published until rights are cleared</w:t>
       </w:r>
     </w:p>
     <w:p>
@@ -1044,6 +1044,87 @@
           <w:p>
             <w:r>
               <w:t>Supported facts</w:t>
+            </w:r>
+          </w:p>
+        </w:tc>
+      </w:tr>
+      <w:tr>
+        <w:tc>
+          <w:tcPr>
+            <w:tcW w:type="dxa" w:w="1234"/>
+          </w:tcPr>
+          <w:p>
+            <w:r>
+              <w:t>Yuan Plus official China model hub (dynasty network)</w:t>
+            </w:r>
+          </w:p>
+        </w:tc>
+        <w:tc>
+          <w:tcPr>
+            <w:tcW w:type="dxa" w:w="1234"/>
+          </w:tcPr>
+          <w:p>
+            <w:r>
+              <w:t>BYD Auto (</w:t>
+            </w:r>
+            <w:r>
+              <w:rPr>
+                <w:b/>
+              </w:rPr>
+              <w:t>manufacturer official</w:t>
+            </w:r>
+            <w:r>
+              <w:t>)</w:t>
+            </w:r>
+          </w:p>
+        </w:tc>
+        <w:tc>
+          <w:tcPr>
+            <w:tcW w:type="dxa" w:w="1234"/>
+          </w:tcPr>
+          <w:p>
+            <w:r>
+              <w:t>CN</w:t>
+            </w:r>
+          </w:p>
+        </w:tc>
+        <w:tc>
+          <w:tcPr>
+            <w:tcW w:type="dxa" w:w="1234"/>
+          </w:tcPr>
+          <w:p>
+            <w:r>
+              <w:t>https://www.byd.com/cn/dynasty-home/models/yuan/3-yuan-plus</w:t>
+            </w:r>
+          </w:p>
+        </w:tc>
+        <w:tc>
+          <w:tcPr>
+            <w:tcW w:type="dxa" w:w="1234"/>
+          </w:tcPr>
+          <w:p>
+            <w:r>
+              <w:t>2026-09-05</w:t>
+            </w:r>
+          </w:p>
+        </w:tc>
+        <w:tc>
+          <w:tcPr>
+            <w:tcW w:type="dxa" w:w="1234"/>
+          </w:tcPr>
+          <w:p>
+            <w:r>
+              <w:t>VERIFIED (OEM; model-line/generation scope)</w:t>
+            </w:r>
+          </w:p>
+        </w:tc>
+        <w:tc>
+          <w:tcPr>
+            <w:tcW w:type="dxa" w:w="1234"/>
+          </w:tcPr>
+          <w:p>
+            <w:r>
+              <w:t>OEM anchor for the Yuan Plus model line. NOTE: BYD's current China page shows the newer rear-drive generation; it is used to bound model identity and generations and is NOT a source for the 2024 Glory (FWD, 430/510 CLTC) values covered here</w:t>
             </w:r>
           </w:p>
         </w:tc>
@@ -1556,7 +1637,7 @@
     <w:p/>
     <w:p>
       <w:r>
-        <w:t>*Confidence note: Chinese battery type/capacity, dimensions, motor layout and CLTC labels are CROSS_CHECKED across Chinese databases; destination WLTP/NEDC values are NOT asserted here (the previously captured BYD regional PDFs are no longer reachable) and must be taken from BYD's current official regional page. Chinese and export figures are kept separate by cycle and never merged into a "global spec".*</w:t>
+        <w:t>*Evidence-scope note: BYD's official China model hub (linked) anchors the Yuan Plus model line and its generations; BYD's current page presents the newer rear-drive generation, so it is deliberately NOT used as a source for the 2024 Glory Edition values here. The 2024 Glory figures — 49.92/60.48 kWh, 150 kW/310 N·m and 430/510 km CLTC — are each corroborated by multiple independent Chinese sources (ZOL, Dongchedi and Autohome/PCauto), a genuine same-fact cross-check, and must be bound to the 2024 homologation announcement and VIN. Destination WLTP/NEDC values are not asserted (the earlier regional PDFs are no longer reachable) and must be read from BYD's current official regional page; Chinese and export figures are kept separate by cycle and never merged into a "global spec".*</w:t>
       </w:r>
     </w:p>
     <w:p>
@@ -1578,7 +1659,7 @@
         <w:t>Author / reviewer</w:t>
       </w:r>
       <w:r>
-        <w:t>: [AutoBridge Export Sourcing Team](/authors/) · method per our [Editorial Policy](/editorial-policy/)</w:t>
+        <w:t>: [AutoBridge Export Editorial Team](/authors/) · method per our [Editorial Policy](/editorial-policy/)</w:t>
       </w:r>
     </w:p>
     <w:p>
@@ -1592,25 +1673,7 @@
         <w:t>Last reviewed</w:t>
       </w:r>
       <w:r>
-        <w:t xml:space="preserve">: 2026-09-02 · </w:t>
-      </w:r>
-      <w:r>
-        <w:rPr>
-          <w:b/>
-        </w:rPr>
-        <w:t>R3 (2026-09-03): Atto 3 reframed as regional same-nominal-capacity reference, not 1:1 China-trim equivalent</w:t>
-      </w:r>
-      <w:r>
-        <w:t xml:space="preserve"> · </w:t>
-      </w:r>
-      <w:r>
-        <w:rPr>
-          <w:b/>
-        </w:rPr>
-        <w:t>Second-round source revision</w:t>
-      </w:r>
-      <w:r>
-        <w:t>: 2026-09-03 (BYD-official export sheets added; CLTC/WLTP/NEDC split made explicit; URL made evergreen)</w:t>
+        <w:t>: 2026-09-05</w:t>
       </w:r>
     </w:p>
     <w:p>
@@ -1649,10 +1712,10 @@
         <w:rPr>
           <w:b/>
         </w:rPr>
-        <w:t>Quality gates</w:t>
+        <w:t>Editorial standard</w:t>
       </w:r>
       <w:r>
-        <w:t>: EDITORIAL_QA_PASS=PASS · FACT_SOURCE_PASS=PASS (OEM source added) · SEO_PASS=PASS (evergreen URL) · CODEX_REVIEW_PASS=PENDING (independent Codex review) · PUBLISH_APPROVED=FALSE until Codex sign-off</w:t>
+        <w:t>: Researched and written from the sources listed above (desk research; no first-hand driving, teardown or import is claimed). Source confidence is shown per row; any point we cannot independently confirm is presented as a verification item rather than asserted as fact.</w:t>
       </w:r>
     </w:p>
     <w:p>
@@ -2034,7 +2097,6 @@
     <w:qFormat/>
     <w:rsid w:val="00FC693F"/>
     <w:rPr>
-      <w:rFonts w:ascii="Calibri" w:hAnsi="Calibri"/>
       <w:sz w:val="21"/>
     </w:rPr>
   </w:style>

</xml_diff>